<commit_message>
Précise que les 15 € de terrain s'ajoutent au tarif du moniteur
Les colonnes de tarifs de la liste portent la mention « hors terrain »,
et les deux documents énoncent que l'élève paie le tarif du moniteur
plus 15 € de terrain, ces 15 € étant reversés à l'école.

Co-Authored-By: Claude Opus 5 <noreply@anthropic.com>
Claude-Session: https://claude.ai/code/session_01RsDkbcD3KwyPviDTcs72WZ
</commit_message>
<xml_diff>
--- a/Cours_prives_liste_moniteurs.docx
+++ b/Cours_prives_liste_moniteurs.docx
@@ -4,7 +4,7 @@
   <w:body>
     <w:tbl>
       <w:tblPr>
-        <w:tblW w:type="dxa" w:w="15133"/>
+        <w:tblW w:type="dxa" w:w="15134"/>
         <w:tblBorders>
           <w:top w:val="none" w:color="FFFFFF" w:sz="0"/>
           <w:left w:val="none" w:color="FFFFFF" w:sz="0"/>
@@ -168,7 +168,7 @@
     </w:p>
     <w:tbl>
       <w:tblPr>
-        <w:tblW w:type="dxa" w:w="15133"/>
+        <w:tblW w:type="dxa" w:w="15134"/>
         <w:tblBorders>
           <w:top w:val="single" w:color="8A9E28" w:sz="6"/>
           <w:left w:val="single" w:color="8A9E28" w:sz="6"/>
@@ -184,9 +184,9 @@
         <w:gridCol w:w="3174"/>
         <w:gridCol w:w="793"/>
         <w:gridCol w:w="1587"/>
-        <w:gridCol w:w="1360"/>
-        <w:gridCol w:w="1360"/>
-        <w:gridCol w:w="2381"/>
+        <w:gridCol w:w="1474"/>
+        <w:gridCol w:w="1474"/>
+        <w:gridCol w:w="2154"/>
       </w:tblGrid>
       <w:tr>
         <w:trPr>
@@ -362,7 +362,7 @@
         </w:tc>
         <w:tc>
           <w:tcPr>
-            <w:tcW w:type="dxa" w:w="1360"/>
+            <w:tcW w:type="dxa" w:w="1474"/>
             <w:shd w:fill="8A9E28" w:color="auto" w:val="clear"/>
             <w:tcMar>
               <w:top w:type="dxa" w:w="85"/>
@@ -403,13 +403,13 @@
                 <w:sz w:val="17"/>
                 <w:szCs w:val="17"/>
               </w:rPr>
-              <w:t xml:space="preserve">(€ / h)</w:t>
-            </w:r>
-          </w:p>
-        </w:tc>
-        <w:tc>
-          <w:tcPr>
-            <w:tcW w:type="dxa" w:w="1360"/>
+              <w:t xml:space="preserve">hors terrain</w:t>
+            </w:r>
+          </w:p>
+        </w:tc>
+        <w:tc>
+          <w:tcPr>
+            <w:tcW w:type="dxa" w:w="1474"/>
             <w:shd w:fill="8A9E28" w:color="auto" w:val="clear"/>
             <w:tcMar>
               <w:top w:type="dxa" w:w="85"/>
@@ -450,13 +450,13 @@
                 <w:sz w:val="17"/>
                 <w:szCs w:val="17"/>
               </w:rPr>
-              <w:t xml:space="preserve">(€ / h)</w:t>
-            </w:r>
-          </w:p>
-        </w:tc>
-        <w:tc>
-          <w:tcPr>
-            <w:tcW w:type="dxa" w:w="2381"/>
+              <w:t xml:space="preserve">hors terrain</w:t>
+            </w:r>
+          </w:p>
+        </w:tc>
+        <w:tc>
+          <w:tcPr>
+            <w:tcW w:type="dxa" w:w="2154"/>
             <w:shd w:fill="8A9E28" w:color="auto" w:val="clear"/>
             <w:tcMar>
               <w:top w:type="dxa" w:w="85"/>
@@ -621,59 +621,59 @@
         </w:tc>
         <w:tc>
           <w:tcPr>
-            <w:tcW w:type="dxa" w:w="1360"/>
-            <w:shd w:fill="FFFFFF" w:color="auto" w:val="clear"/>
-            <w:tcMar>
-              <w:top w:type="dxa" w:w="56"/>
-              <w:left w:type="dxa" w:w="113"/>
-              <w:bottom w:type="dxa" w:w="56"/>
-              <w:right w:type="dxa" w:w="113"/>
-            </w:tcMar>
-          </w:tcPr>
-          <w:p>
-            <w:pPr>
-              <w:spacing w:after="0" w:before="0" w:line="252"/>
-            </w:pPr>
-            <w:r>
-              <w:rPr>
-                <w:rFonts w:ascii="Calibri" w:cs="Calibri" w:eastAsia="Calibri" w:hAnsi="Calibri"/>
-                <w:color w:val="2E2E2E"/>
-                <w:sz w:val="20"/>
-                <w:szCs w:val="20"/>
-              </w:rPr>
-              <w:t xml:space="preserve"/>
-            </w:r>
-          </w:p>
-        </w:tc>
-        <w:tc>
-          <w:tcPr>
-            <w:tcW w:type="dxa" w:w="1360"/>
-            <w:shd w:fill="FFFFFF" w:color="auto" w:val="clear"/>
-            <w:tcMar>
-              <w:top w:type="dxa" w:w="56"/>
-              <w:left w:type="dxa" w:w="113"/>
-              <w:bottom w:type="dxa" w:w="56"/>
-              <w:right w:type="dxa" w:w="113"/>
-            </w:tcMar>
-          </w:tcPr>
-          <w:p>
-            <w:pPr>
-              <w:spacing w:after="0" w:before="0" w:line="252"/>
-            </w:pPr>
-            <w:r>
-              <w:rPr>
-                <w:rFonts w:ascii="Calibri" w:cs="Calibri" w:eastAsia="Calibri" w:hAnsi="Calibri"/>
-                <w:color w:val="2E2E2E"/>
-                <w:sz w:val="20"/>
-                <w:szCs w:val="20"/>
-              </w:rPr>
-              <w:t xml:space="preserve"/>
-            </w:r>
-          </w:p>
-        </w:tc>
-        <w:tc>
-          <w:tcPr>
-            <w:tcW w:type="dxa" w:w="2381"/>
+            <w:tcW w:type="dxa" w:w="1474"/>
+            <w:shd w:fill="FFFFFF" w:color="auto" w:val="clear"/>
+            <w:tcMar>
+              <w:top w:type="dxa" w:w="56"/>
+              <w:left w:type="dxa" w:w="113"/>
+              <w:bottom w:type="dxa" w:w="56"/>
+              <w:right w:type="dxa" w:w="113"/>
+            </w:tcMar>
+          </w:tcPr>
+          <w:p>
+            <w:pPr>
+              <w:spacing w:after="0" w:before="0" w:line="252"/>
+            </w:pPr>
+            <w:r>
+              <w:rPr>
+                <w:rFonts w:ascii="Calibri" w:cs="Calibri" w:eastAsia="Calibri" w:hAnsi="Calibri"/>
+                <w:color w:val="2E2E2E"/>
+                <w:sz w:val="20"/>
+                <w:szCs w:val="20"/>
+              </w:rPr>
+              <w:t xml:space="preserve"/>
+            </w:r>
+          </w:p>
+        </w:tc>
+        <w:tc>
+          <w:tcPr>
+            <w:tcW w:type="dxa" w:w="1474"/>
+            <w:shd w:fill="FFFFFF" w:color="auto" w:val="clear"/>
+            <w:tcMar>
+              <w:top w:type="dxa" w:w="56"/>
+              <w:left w:type="dxa" w:w="113"/>
+              <w:bottom w:type="dxa" w:w="56"/>
+              <w:right w:type="dxa" w:w="113"/>
+            </w:tcMar>
+          </w:tcPr>
+          <w:p>
+            <w:pPr>
+              <w:spacing w:after="0" w:before="0" w:line="252"/>
+            </w:pPr>
+            <w:r>
+              <w:rPr>
+                <w:rFonts w:ascii="Calibri" w:cs="Calibri" w:eastAsia="Calibri" w:hAnsi="Calibri"/>
+                <w:color w:val="2E2E2E"/>
+                <w:sz w:val="20"/>
+                <w:szCs w:val="20"/>
+              </w:rPr>
+              <w:t xml:space="preserve"/>
+            </w:r>
+          </w:p>
+        </w:tc>
+        <w:tc>
+          <w:tcPr>
+            <w:tcW w:type="dxa" w:w="2154"/>
             <w:shd w:fill="FFFFFF" w:color="auto" w:val="clear"/>
             <w:tcMar>
               <w:top w:type="dxa" w:w="56"/>
@@ -834,59 +834,59 @@
         </w:tc>
         <w:tc>
           <w:tcPr>
-            <w:tcW w:type="dxa" w:w="1360"/>
-            <w:shd w:fill="FAFAF6" w:color="auto" w:val="clear"/>
-            <w:tcMar>
-              <w:top w:type="dxa" w:w="56"/>
-              <w:left w:type="dxa" w:w="113"/>
-              <w:bottom w:type="dxa" w:w="56"/>
-              <w:right w:type="dxa" w:w="113"/>
-            </w:tcMar>
-          </w:tcPr>
-          <w:p>
-            <w:pPr>
-              <w:spacing w:after="0" w:before="0" w:line="252"/>
-            </w:pPr>
-            <w:r>
-              <w:rPr>
-                <w:rFonts w:ascii="Calibri" w:cs="Calibri" w:eastAsia="Calibri" w:hAnsi="Calibri"/>
-                <w:color w:val="2E2E2E"/>
-                <w:sz w:val="20"/>
-                <w:szCs w:val="20"/>
-              </w:rPr>
-              <w:t xml:space="preserve"/>
-            </w:r>
-          </w:p>
-        </w:tc>
-        <w:tc>
-          <w:tcPr>
-            <w:tcW w:type="dxa" w:w="1360"/>
-            <w:shd w:fill="FAFAF6" w:color="auto" w:val="clear"/>
-            <w:tcMar>
-              <w:top w:type="dxa" w:w="56"/>
-              <w:left w:type="dxa" w:w="113"/>
-              <w:bottom w:type="dxa" w:w="56"/>
-              <w:right w:type="dxa" w:w="113"/>
-            </w:tcMar>
-          </w:tcPr>
-          <w:p>
-            <w:pPr>
-              <w:spacing w:after="0" w:before="0" w:line="252"/>
-            </w:pPr>
-            <w:r>
-              <w:rPr>
-                <w:rFonts w:ascii="Calibri" w:cs="Calibri" w:eastAsia="Calibri" w:hAnsi="Calibri"/>
-                <w:color w:val="2E2E2E"/>
-                <w:sz w:val="20"/>
-                <w:szCs w:val="20"/>
-              </w:rPr>
-              <w:t xml:space="preserve"/>
-            </w:r>
-          </w:p>
-        </w:tc>
-        <w:tc>
-          <w:tcPr>
-            <w:tcW w:type="dxa" w:w="2381"/>
+            <w:tcW w:type="dxa" w:w="1474"/>
+            <w:shd w:fill="FAFAF6" w:color="auto" w:val="clear"/>
+            <w:tcMar>
+              <w:top w:type="dxa" w:w="56"/>
+              <w:left w:type="dxa" w:w="113"/>
+              <w:bottom w:type="dxa" w:w="56"/>
+              <w:right w:type="dxa" w:w="113"/>
+            </w:tcMar>
+          </w:tcPr>
+          <w:p>
+            <w:pPr>
+              <w:spacing w:after="0" w:before="0" w:line="252"/>
+            </w:pPr>
+            <w:r>
+              <w:rPr>
+                <w:rFonts w:ascii="Calibri" w:cs="Calibri" w:eastAsia="Calibri" w:hAnsi="Calibri"/>
+                <w:color w:val="2E2E2E"/>
+                <w:sz w:val="20"/>
+                <w:szCs w:val="20"/>
+              </w:rPr>
+              <w:t xml:space="preserve"/>
+            </w:r>
+          </w:p>
+        </w:tc>
+        <w:tc>
+          <w:tcPr>
+            <w:tcW w:type="dxa" w:w="1474"/>
+            <w:shd w:fill="FAFAF6" w:color="auto" w:val="clear"/>
+            <w:tcMar>
+              <w:top w:type="dxa" w:w="56"/>
+              <w:left w:type="dxa" w:w="113"/>
+              <w:bottom w:type="dxa" w:w="56"/>
+              <w:right w:type="dxa" w:w="113"/>
+            </w:tcMar>
+          </w:tcPr>
+          <w:p>
+            <w:pPr>
+              <w:spacing w:after="0" w:before="0" w:line="252"/>
+            </w:pPr>
+            <w:r>
+              <w:rPr>
+                <w:rFonts w:ascii="Calibri" w:cs="Calibri" w:eastAsia="Calibri" w:hAnsi="Calibri"/>
+                <w:color w:val="2E2E2E"/>
+                <w:sz w:val="20"/>
+                <w:szCs w:val="20"/>
+              </w:rPr>
+              <w:t xml:space="preserve"/>
+            </w:r>
+          </w:p>
+        </w:tc>
+        <w:tc>
+          <w:tcPr>
+            <w:tcW w:type="dxa" w:w="2154"/>
             <w:shd w:fill="FAFAF6" w:color="auto" w:val="clear"/>
             <w:tcMar>
               <w:top w:type="dxa" w:w="56"/>
@@ -1047,59 +1047,59 @@
         </w:tc>
         <w:tc>
           <w:tcPr>
-            <w:tcW w:type="dxa" w:w="1360"/>
-            <w:shd w:fill="FFFFFF" w:color="auto" w:val="clear"/>
-            <w:tcMar>
-              <w:top w:type="dxa" w:w="56"/>
-              <w:left w:type="dxa" w:w="113"/>
-              <w:bottom w:type="dxa" w:w="56"/>
-              <w:right w:type="dxa" w:w="113"/>
-            </w:tcMar>
-          </w:tcPr>
-          <w:p>
-            <w:pPr>
-              <w:spacing w:after="0" w:before="0" w:line="252"/>
-            </w:pPr>
-            <w:r>
-              <w:rPr>
-                <w:rFonts w:ascii="Calibri" w:cs="Calibri" w:eastAsia="Calibri" w:hAnsi="Calibri"/>
-                <w:color w:val="2E2E2E"/>
-                <w:sz w:val="20"/>
-                <w:szCs w:val="20"/>
-              </w:rPr>
-              <w:t xml:space="preserve"/>
-            </w:r>
-          </w:p>
-        </w:tc>
-        <w:tc>
-          <w:tcPr>
-            <w:tcW w:type="dxa" w:w="1360"/>
-            <w:shd w:fill="FFFFFF" w:color="auto" w:val="clear"/>
-            <w:tcMar>
-              <w:top w:type="dxa" w:w="56"/>
-              <w:left w:type="dxa" w:w="113"/>
-              <w:bottom w:type="dxa" w:w="56"/>
-              <w:right w:type="dxa" w:w="113"/>
-            </w:tcMar>
-          </w:tcPr>
-          <w:p>
-            <w:pPr>
-              <w:spacing w:after="0" w:before="0" w:line="252"/>
-            </w:pPr>
-            <w:r>
-              <w:rPr>
-                <w:rFonts w:ascii="Calibri" w:cs="Calibri" w:eastAsia="Calibri" w:hAnsi="Calibri"/>
-                <w:color w:val="2E2E2E"/>
-                <w:sz w:val="20"/>
-                <w:szCs w:val="20"/>
-              </w:rPr>
-              <w:t xml:space="preserve"/>
-            </w:r>
-          </w:p>
-        </w:tc>
-        <w:tc>
-          <w:tcPr>
-            <w:tcW w:type="dxa" w:w="2381"/>
+            <w:tcW w:type="dxa" w:w="1474"/>
+            <w:shd w:fill="FFFFFF" w:color="auto" w:val="clear"/>
+            <w:tcMar>
+              <w:top w:type="dxa" w:w="56"/>
+              <w:left w:type="dxa" w:w="113"/>
+              <w:bottom w:type="dxa" w:w="56"/>
+              <w:right w:type="dxa" w:w="113"/>
+            </w:tcMar>
+          </w:tcPr>
+          <w:p>
+            <w:pPr>
+              <w:spacing w:after="0" w:before="0" w:line="252"/>
+            </w:pPr>
+            <w:r>
+              <w:rPr>
+                <w:rFonts w:ascii="Calibri" w:cs="Calibri" w:eastAsia="Calibri" w:hAnsi="Calibri"/>
+                <w:color w:val="2E2E2E"/>
+                <w:sz w:val="20"/>
+                <w:szCs w:val="20"/>
+              </w:rPr>
+              <w:t xml:space="preserve"/>
+            </w:r>
+          </w:p>
+        </w:tc>
+        <w:tc>
+          <w:tcPr>
+            <w:tcW w:type="dxa" w:w="1474"/>
+            <w:shd w:fill="FFFFFF" w:color="auto" w:val="clear"/>
+            <w:tcMar>
+              <w:top w:type="dxa" w:w="56"/>
+              <w:left w:type="dxa" w:w="113"/>
+              <w:bottom w:type="dxa" w:w="56"/>
+              <w:right w:type="dxa" w:w="113"/>
+            </w:tcMar>
+          </w:tcPr>
+          <w:p>
+            <w:pPr>
+              <w:spacing w:after="0" w:before="0" w:line="252"/>
+            </w:pPr>
+            <w:r>
+              <w:rPr>
+                <w:rFonts w:ascii="Calibri" w:cs="Calibri" w:eastAsia="Calibri" w:hAnsi="Calibri"/>
+                <w:color w:val="2E2E2E"/>
+                <w:sz w:val="20"/>
+                <w:szCs w:val="20"/>
+              </w:rPr>
+              <w:t xml:space="preserve"/>
+            </w:r>
+          </w:p>
+        </w:tc>
+        <w:tc>
+          <w:tcPr>
+            <w:tcW w:type="dxa" w:w="2154"/>
             <w:shd w:fill="FFFFFF" w:color="auto" w:val="clear"/>
             <w:tcMar>
               <w:top w:type="dxa" w:w="56"/>
@@ -1260,59 +1260,59 @@
         </w:tc>
         <w:tc>
           <w:tcPr>
-            <w:tcW w:type="dxa" w:w="1360"/>
-            <w:shd w:fill="FAFAF6" w:color="auto" w:val="clear"/>
-            <w:tcMar>
-              <w:top w:type="dxa" w:w="56"/>
-              <w:left w:type="dxa" w:w="113"/>
-              <w:bottom w:type="dxa" w:w="56"/>
-              <w:right w:type="dxa" w:w="113"/>
-            </w:tcMar>
-          </w:tcPr>
-          <w:p>
-            <w:pPr>
-              <w:spacing w:after="0" w:before="0" w:line="252"/>
-            </w:pPr>
-            <w:r>
-              <w:rPr>
-                <w:rFonts w:ascii="Calibri" w:cs="Calibri" w:eastAsia="Calibri" w:hAnsi="Calibri"/>
-                <w:color w:val="2E2E2E"/>
-                <w:sz w:val="20"/>
-                <w:szCs w:val="20"/>
-              </w:rPr>
-              <w:t xml:space="preserve"/>
-            </w:r>
-          </w:p>
-        </w:tc>
-        <w:tc>
-          <w:tcPr>
-            <w:tcW w:type="dxa" w:w="1360"/>
-            <w:shd w:fill="FAFAF6" w:color="auto" w:val="clear"/>
-            <w:tcMar>
-              <w:top w:type="dxa" w:w="56"/>
-              <w:left w:type="dxa" w:w="113"/>
-              <w:bottom w:type="dxa" w:w="56"/>
-              <w:right w:type="dxa" w:w="113"/>
-            </w:tcMar>
-          </w:tcPr>
-          <w:p>
-            <w:pPr>
-              <w:spacing w:after="0" w:before="0" w:line="252"/>
-            </w:pPr>
-            <w:r>
-              <w:rPr>
-                <w:rFonts w:ascii="Calibri" w:cs="Calibri" w:eastAsia="Calibri" w:hAnsi="Calibri"/>
-                <w:color w:val="2E2E2E"/>
-                <w:sz w:val="20"/>
-                <w:szCs w:val="20"/>
-              </w:rPr>
-              <w:t xml:space="preserve"/>
-            </w:r>
-          </w:p>
-        </w:tc>
-        <w:tc>
-          <w:tcPr>
-            <w:tcW w:type="dxa" w:w="2381"/>
+            <w:tcW w:type="dxa" w:w="1474"/>
+            <w:shd w:fill="FAFAF6" w:color="auto" w:val="clear"/>
+            <w:tcMar>
+              <w:top w:type="dxa" w:w="56"/>
+              <w:left w:type="dxa" w:w="113"/>
+              <w:bottom w:type="dxa" w:w="56"/>
+              <w:right w:type="dxa" w:w="113"/>
+            </w:tcMar>
+          </w:tcPr>
+          <w:p>
+            <w:pPr>
+              <w:spacing w:after="0" w:before="0" w:line="252"/>
+            </w:pPr>
+            <w:r>
+              <w:rPr>
+                <w:rFonts w:ascii="Calibri" w:cs="Calibri" w:eastAsia="Calibri" w:hAnsi="Calibri"/>
+                <w:color w:val="2E2E2E"/>
+                <w:sz w:val="20"/>
+                <w:szCs w:val="20"/>
+              </w:rPr>
+              <w:t xml:space="preserve"/>
+            </w:r>
+          </w:p>
+        </w:tc>
+        <w:tc>
+          <w:tcPr>
+            <w:tcW w:type="dxa" w:w="1474"/>
+            <w:shd w:fill="FAFAF6" w:color="auto" w:val="clear"/>
+            <w:tcMar>
+              <w:top w:type="dxa" w:w="56"/>
+              <w:left w:type="dxa" w:w="113"/>
+              <w:bottom w:type="dxa" w:w="56"/>
+              <w:right w:type="dxa" w:w="113"/>
+            </w:tcMar>
+          </w:tcPr>
+          <w:p>
+            <w:pPr>
+              <w:spacing w:after="0" w:before="0" w:line="252"/>
+            </w:pPr>
+            <w:r>
+              <w:rPr>
+                <w:rFonts w:ascii="Calibri" w:cs="Calibri" w:eastAsia="Calibri" w:hAnsi="Calibri"/>
+                <w:color w:val="2E2E2E"/>
+                <w:sz w:val="20"/>
+                <w:szCs w:val="20"/>
+              </w:rPr>
+              <w:t xml:space="preserve"/>
+            </w:r>
+          </w:p>
+        </w:tc>
+        <w:tc>
+          <w:tcPr>
+            <w:tcW w:type="dxa" w:w="2154"/>
             <w:shd w:fill="FAFAF6" w:color="auto" w:val="clear"/>
             <w:tcMar>
               <w:top w:type="dxa" w:w="56"/>
@@ -1473,59 +1473,59 @@
         </w:tc>
         <w:tc>
           <w:tcPr>
-            <w:tcW w:type="dxa" w:w="1360"/>
-            <w:shd w:fill="FFFFFF" w:color="auto" w:val="clear"/>
-            <w:tcMar>
-              <w:top w:type="dxa" w:w="56"/>
-              <w:left w:type="dxa" w:w="113"/>
-              <w:bottom w:type="dxa" w:w="56"/>
-              <w:right w:type="dxa" w:w="113"/>
-            </w:tcMar>
-          </w:tcPr>
-          <w:p>
-            <w:pPr>
-              <w:spacing w:after="0" w:before="0" w:line="252"/>
-            </w:pPr>
-            <w:r>
-              <w:rPr>
-                <w:rFonts w:ascii="Calibri" w:cs="Calibri" w:eastAsia="Calibri" w:hAnsi="Calibri"/>
-                <w:color w:val="2E2E2E"/>
-                <w:sz w:val="20"/>
-                <w:szCs w:val="20"/>
-              </w:rPr>
-              <w:t xml:space="preserve"/>
-            </w:r>
-          </w:p>
-        </w:tc>
-        <w:tc>
-          <w:tcPr>
-            <w:tcW w:type="dxa" w:w="1360"/>
-            <w:shd w:fill="FFFFFF" w:color="auto" w:val="clear"/>
-            <w:tcMar>
-              <w:top w:type="dxa" w:w="56"/>
-              <w:left w:type="dxa" w:w="113"/>
-              <w:bottom w:type="dxa" w:w="56"/>
-              <w:right w:type="dxa" w:w="113"/>
-            </w:tcMar>
-          </w:tcPr>
-          <w:p>
-            <w:pPr>
-              <w:spacing w:after="0" w:before="0" w:line="252"/>
-            </w:pPr>
-            <w:r>
-              <w:rPr>
-                <w:rFonts w:ascii="Calibri" w:cs="Calibri" w:eastAsia="Calibri" w:hAnsi="Calibri"/>
-                <w:color w:val="2E2E2E"/>
-                <w:sz w:val="20"/>
-                <w:szCs w:val="20"/>
-              </w:rPr>
-              <w:t xml:space="preserve"/>
-            </w:r>
-          </w:p>
-        </w:tc>
-        <w:tc>
-          <w:tcPr>
-            <w:tcW w:type="dxa" w:w="2381"/>
+            <w:tcW w:type="dxa" w:w="1474"/>
+            <w:shd w:fill="FFFFFF" w:color="auto" w:val="clear"/>
+            <w:tcMar>
+              <w:top w:type="dxa" w:w="56"/>
+              <w:left w:type="dxa" w:w="113"/>
+              <w:bottom w:type="dxa" w:w="56"/>
+              <w:right w:type="dxa" w:w="113"/>
+            </w:tcMar>
+          </w:tcPr>
+          <w:p>
+            <w:pPr>
+              <w:spacing w:after="0" w:before="0" w:line="252"/>
+            </w:pPr>
+            <w:r>
+              <w:rPr>
+                <w:rFonts w:ascii="Calibri" w:cs="Calibri" w:eastAsia="Calibri" w:hAnsi="Calibri"/>
+                <w:color w:val="2E2E2E"/>
+                <w:sz w:val="20"/>
+                <w:szCs w:val="20"/>
+              </w:rPr>
+              <w:t xml:space="preserve"/>
+            </w:r>
+          </w:p>
+        </w:tc>
+        <w:tc>
+          <w:tcPr>
+            <w:tcW w:type="dxa" w:w="1474"/>
+            <w:shd w:fill="FFFFFF" w:color="auto" w:val="clear"/>
+            <w:tcMar>
+              <w:top w:type="dxa" w:w="56"/>
+              <w:left w:type="dxa" w:w="113"/>
+              <w:bottom w:type="dxa" w:w="56"/>
+              <w:right w:type="dxa" w:w="113"/>
+            </w:tcMar>
+          </w:tcPr>
+          <w:p>
+            <w:pPr>
+              <w:spacing w:after="0" w:before="0" w:line="252"/>
+            </w:pPr>
+            <w:r>
+              <w:rPr>
+                <w:rFonts w:ascii="Calibri" w:cs="Calibri" w:eastAsia="Calibri" w:hAnsi="Calibri"/>
+                <w:color w:val="2E2E2E"/>
+                <w:sz w:val="20"/>
+                <w:szCs w:val="20"/>
+              </w:rPr>
+              <w:t xml:space="preserve"/>
+            </w:r>
+          </w:p>
+        </w:tc>
+        <w:tc>
+          <w:tcPr>
+            <w:tcW w:type="dxa" w:w="2154"/>
             <w:shd w:fill="FFFFFF" w:color="auto" w:val="clear"/>
             <w:tcMar>
               <w:top w:type="dxa" w:w="56"/>
@@ -1686,59 +1686,59 @@
         </w:tc>
         <w:tc>
           <w:tcPr>
-            <w:tcW w:type="dxa" w:w="1360"/>
-            <w:shd w:fill="FAFAF6" w:color="auto" w:val="clear"/>
-            <w:tcMar>
-              <w:top w:type="dxa" w:w="56"/>
-              <w:left w:type="dxa" w:w="113"/>
-              <w:bottom w:type="dxa" w:w="56"/>
-              <w:right w:type="dxa" w:w="113"/>
-            </w:tcMar>
-          </w:tcPr>
-          <w:p>
-            <w:pPr>
-              <w:spacing w:after="0" w:before="0" w:line="252"/>
-            </w:pPr>
-            <w:r>
-              <w:rPr>
-                <w:rFonts w:ascii="Calibri" w:cs="Calibri" w:eastAsia="Calibri" w:hAnsi="Calibri"/>
-                <w:color w:val="2E2E2E"/>
-                <w:sz w:val="20"/>
-                <w:szCs w:val="20"/>
-              </w:rPr>
-              <w:t xml:space="preserve"/>
-            </w:r>
-          </w:p>
-        </w:tc>
-        <w:tc>
-          <w:tcPr>
-            <w:tcW w:type="dxa" w:w="1360"/>
-            <w:shd w:fill="FAFAF6" w:color="auto" w:val="clear"/>
-            <w:tcMar>
-              <w:top w:type="dxa" w:w="56"/>
-              <w:left w:type="dxa" w:w="113"/>
-              <w:bottom w:type="dxa" w:w="56"/>
-              <w:right w:type="dxa" w:w="113"/>
-            </w:tcMar>
-          </w:tcPr>
-          <w:p>
-            <w:pPr>
-              <w:spacing w:after="0" w:before="0" w:line="252"/>
-            </w:pPr>
-            <w:r>
-              <w:rPr>
-                <w:rFonts w:ascii="Calibri" w:cs="Calibri" w:eastAsia="Calibri" w:hAnsi="Calibri"/>
-                <w:color w:val="2E2E2E"/>
-                <w:sz w:val="20"/>
-                <w:szCs w:val="20"/>
-              </w:rPr>
-              <w:t xml:space="preserve"/>
-            </w:r>
-          </w:p>
-        </w:tc>
-        <w:tc>
-          <w:tcPr>
-            <w:tcW w:type="dxa" w:w="2381"/>
+            <w:tcW w:type="dxa" w:w="1474"/>
+            <w:shd w:fill="FAFAF6" w:color="auto" w:val="clear"/>
+            <w:tcMar>
+              <w:top w:type="dxa" w:w="56"/>
+              <w:left w:type="dxa" w:w="113"/>
+              <w:bottom w:type="dxa" w:w="56"/>
+              <w:right w:type="dxa" w:w="113"/>
+            </w:tcMar>
+          </w:tcPr>
+          <w:p>
+            <w:pPr>
+              <w:spacing w:after="0" w:before="0" w:line="252"/>
+            </w:pPr>
+            <w:r>
+              <w:rPr>
+                <w:rFonts w:ascii="Calibri" w:cs="Calibri" w:eastAsia="Calibri" w:hAnsi="Calibri"/>
+                <w:color w:val="2E2E2E"/>
+                <w:sz w:val="20"/>
+                <w:szCs w:val="20"/>
+              </w:rPr>
+              <w:t xml:space="preserve"/>
+            </w:r>
+          </w:p>
+        </w:tc>
+        <w:tc>
+          <w:tcPr>
+            <w:tcW w:type="dxa" w:w="1474"/>
+            <w:shd w:fill="FAFAF6" w:color="auto" w:val="clear"/>
+            <w:tcMar>
+              <w:top w:type="dxa" w:w="56"/>
+              <w:left w:type="dxa" w:w="113"/>
+              <w:bottom w:type="dxa" w:w="56"/>
+              <w:right w:type="dxa" w:w="113"/>
+            </w:tcMar>
+          </w:tcPr>
+          <w:p>
+            <w:pPr>
+              <w:spacing w:after="0" w:before="0" w:line="252"/>
+            </w:pPr>
+            <w:r>
+              <w:rPr>
+                <w:rFonts w:ascii="Calibri" w:cs="Calibri" w:eastAsia="Calibri" w:hAnsi="Calibri"/>
+                <w:color w:val="2E2E2E"/>
+                <w:sz w:val="20"/>
+                <w:szCs w:val="20"/>
+              </w:rPr>
+              <w:t xml:space="preserve"/>
+            </w:r>
+          </w:p>
+        </w:tc>
+        <w:tc>
+          <w:tcPr>
+            <w:tcW w:type="dxa" w:w="2154"/>
             <w:shd w:fill="FAFAF6" w:color="auto" w:val="clear"/>
             <w:tcMar>
               <w:top w:type="dxa" w:w="56"/>
@@ -1899,59 +1899,59 @@
         </w:tc>
         <w:tc>
           <w:tcPr>
-            <w:tcW w:type="dxa" w:w="1360"/>
-            <w:shd w:fill="FFFFFF" w:color="auto" w:val="clear"/>
-            <w:tcMar>
-              <w:top w:type="dxa" w:w="56"/>
-              <w:left w:type="dxa" w:w="113"/>
-              <w:bottom w:type="dxa" w:w="56"/>
-              <w:right w:type="dxa" w:w="113"/>
-            </w:tcMar>
-          </w:tcPr>
-          <w:p>
-            <w:pPr>
-              <w:spacing w:after="0" w:before="0" w:line="252"/>
-            </w:pPr>
-            <w:r>
-              <w:rPr>
-                <w:rFonts w:ascii="Calibri" w:cs="Calibri" w:eastAsia="Calibri" w:hAnsi="Calibri"/>
-                <w:color w:val="2E2E2E"/>
-                <w:sz w:val="20"/>
-                <w:szCs w:val="20"/>
-              </w:rPr>
-              <w:t xml:space="preserve"/>
-            </w:r>
-          </w:p>
-        </w:tc>
-        <w:tc>
-          <w:tcPr>
-            <w:tcW w:type="dxa" w:w="1360"/>
-            <w:shd w:fill="FFFFFF" w:color="auto" w:val="clear"/>
-            <w:tcMar>
-              <w:top w:type="dxa" w:w="56"/>
-              <w:left w:type="dxa" w:w="113"/>
-              <w:bottom w:type="dxa" w:w="56"/>
-              <w:right w:type="dxa" w:w="113"/>
-            </w:tcMar>
-          </w:tcPr>
-          <w:p>
-            <w:pPr>
-              <w:spacing w:after="0" w:before="0" w:line="252"/>
-            </w:pPr>
-            <w:r>
-              <w:rPr>
-                <w:rFonts w:ascii="Calibri" w:cs="Calibri" w:eastAsia="Calibri" w:hAnsi="Calibri"/>
-                <w:color w:val="2E2E2E"/>
-                <w:sz w:val="20"/>
-                <w:szCs w:val="20"/>
-              </w:rPr>
-              <w:t xml:space="preserve"/>
-            </w:r>
-          </w:p>
-        </w:tc>
-        <w:tc>
-          <w:tcPr>
-            <w:tcW w:type="dxa" w:w="2381"/>
+            <w:tcW w:type="dxa" w:w="1474"/>
+            <w:shd w:fill="FFFFFF" w:color="auto" w:val="clear"/>
+            <w:tcMar>
+              <w:top w:type="dxa" w:w="56"/>
+              <w:left w:type="dxa" w:w="113"/>
+              <w:bottom w:type="dxa" w:w="56"/>
+              <w:right w:type="dxa" w:w="113"/>
+            </w:tcMar>
+          </w:tcPr>
+          <w:p>
+            <w:pPr>
+              <w:spacing w:after="0" w:before="0" w:line="252"/>
+            </w:pPr>
+            <w:r>
+              <w:rPr>
+                <w:rFonts w:ascii="Calibri" w:cs="Calibri" w:eastAsia="Calibri" w:hAnsi="Calibri"/>
+                <w:color w:val="2E2E2E"/>
+                <w:sz w:val="20"/>
+                <w:szCs w:val="20"/>
+              </w:rPr>
+              <w:t xml:space="preserve"/>
+            </w:r>
+          </w:p>
+        </w:tc>
+        <w:tc>
+          <w:tcPr>
+            <w:tcW w:type="dxa" w:w="1474"/>
+            <w:shd w:fill="FFFFFF" w:color="auto" w:val="clear"/>
+            <w:tcMar>
+              <w:top w:type="dxa" w:w="56"/>
+              <w:left w:type="dxa" w:w="113"/>
+              <w:bottom w:type="dxa" w:w="56"/>
+              <w:right w:type="dxa" w:w="113"/>
+            </w:tcMar>
+          </w:tcPr>
+          <w:p>
+            <w:pPr>
+              <w:spacing w:after="0" w:before="0" w:line="252"/>
+            </w:pPr>
+            <w:r>
+              <w:rPr>
+                <w:rFonts w:ascii="Calibri" w:cs="Calibri" w:eastAsia="Calibri" w:hAnsi="Calibri"/>
+                <w:color w:val="2E2E2E"/>
+                <w:sz w:val="20"/>
+                <w:szCs w:val="20"/>
+              </w:rPr>
+              <w:t xml:space="preserve"/>
+            </w:r>
+          </w:p>
+        </w:tc>
+        <w:tc>
+          <w:tcPr>
+            <w:tcW w:type="dxa" w:w="2154"/>
             <w:shd w:fill="FFFFFF" w:color="auto" w:val="clear"/>
             <w:tcMar>
               <w:top w:type="dxa" w:w="56"/>
@@ -2112,59 +2112,59 @@
         </w:tc>
         <w:tc>
           <w:tcPr>
-            <w:tcW w:type="dxa" w:w="1360"/>
-            <w:shd w:fill="FAFAF6" w:color="auto" w:val="clear"/>
-            <w:tcMar>
-              <w:top w:type="dxa" w:w="56"/>
-              <w:left w:type="dxa" w:w="113"/>
-              <w:bottom w:type="dxa" w:w="56"/>
-              <w:right w:type="dxa" w:w="113"/>
-            </w:tcMar>
-          </w:tcPr>
-          <w:p>
-            <w:pPr>
-              <w:spacing w:after="0" w:before="0" w:line="252"/>
-            </w:pPr>
-            <w:r>
-              <w:rPr>
-                <w:rFonts w:ascii="Calibri" w:cs="Calibri" w:eastAsia="Calibri" w:hAnsi="Calibri"/>
-                <w:color w:val="2E2E2E"/>
-                <w:sz w:val="20"/>
-                <w:szCs w:val="20"/>
-              </w:rPr>
-              <w:t xml:space="preserve"/>
-            </w:r>
-          </w:p>
-        </w:tc>
-        <w:tc>
-          <w:tcPr>
-            <w:tcW w:type="dxa" w:w="1360"/>
-            <w:shd w:fill="FAFAF6" w:color="auto" w:val="clear"/>
-            <w:tcMar>
-              <w:top w:type="dxa" w:w="56"/>
-              <w:left w:type="dxa" w:w="113"/>
-              <w:bottom w:type="dxa" w:w="56"/>
-              <w:right w:type="dxa" w:w="113"/>
-            </w:tcMar>
-          </w:tcPr>
-          <w:p>
-            <w:pPr>
-              <w:spacing w:after="0" w:before="0" w:line="252"/>
-            </w:pPr>
-            <w:r>
-              <w:rPr>
-                <w:rFonts w:ascii="Calibri" w:cs="Calibri" w:eastAsia="Calibri" w:hAnsi="Calibri"/>
-                <w:color w:val="2E2E2E"/>
-                <w:sz w:val="20"/>
-                <w:szCs w:val="20"/>
-              </w:rPr>
-              <w:t xml:space="preserve"/>
-            </w:r>
-          </w:p>
-        </w:tc>
-        <w:tc>
-          <w:tcPr>
-            <w:tcW w:type="dxa" w:w="2381"/>
+            <w:tcW w:type="dxa" w:w="1474"/>
+            <w:shd w:fill="FAFAF6" w:color="auto" w:val="clear"/>
+            <w:tcMar>
+              <w:top w:type="dxa" w:w="56"/>
+              <w:left w:type="dxa" w:w="113"/>
+              <w:bottom w:type="dxa" w:w="56"/>
+              <w:right w:type="dxa" w:w="113"/>
+            </w:tcMar>
+          </w:tcPr>
+          <w:p>
+            <w:pPr>
+              <w:spacing w:after="0" w:before="0" w:line="252"/>
+            </w:pPr>
+            <w:r>
+              <w:rPr>
+                <w:rFonts w:ascii="Calibri" w:cs="Calibri" w:eastAsia="Calibri" w:hAnsi="Calibri"/>
+                <w:color w:val="2E2E2E"/>
+                <w:sz w:val="20"/>
+                <w:szCs w:val="20"/>
+              </w:rPr>
+              <w:t xml:space="preserve"/>
+            </w:r>
+          </w:p>
+        </w:tc>
+        <w:tc>
+          <w:tcPr>
+            <w:tcW w:type="dxa" w:w="1474"/>
+            <w:shd w:fill="FAFAF6" w:color="auto" w:val="clear"/>
+            <w:tcMar>
+              <w:top w:type="dxa" w:w="56"/>
+              <w:left w:type="dxa" w:w="113"/>
+              <w:bottom w:type="dxa" w:w="56"/>
+              <w:right w:type="dxa" w:w="113"/>
+            </w:tcMar>
+          </w:tcPr>
+          <w:p>
+            <w:pPr>
+              <w:spacing w:after="0" w:before="0" w:line="252"/>
+            </w:pPr>
+            <w:r>
+              <w:rPr>
+                <w:rFonts w:ascii="Calibri" w:cs="Calibri" w:eastAsia="Calibri" w:hAnsi="Calibri"/>
+                <w:color w:val="2E2E2E"/>
+                <w:sz w:val="20"/>
+                <w:szCs w:val="20"/>
+              </w:rPr>
+              <w:t xml:space="preserve"/>
+            </w:r>
+          </w:p>
+        </w:tc>
+        <w:tc>
+          <w:tcPr>
+            <w:tcW w:type="dxa" w:w="2154"/>
             <w:shd w:fill="FAFAF6" w:color="auto" w:val="clear"/>
             <w:tcMar>
               <w:top w:type="dxa" w:w="56"/>
@@ -2325,59 +2325,59 @@
         </w:tc>
         <w:tc>
           <w:tcPr>
-            <w:tcW w:type="dxa" w:w="1360"/>
-            <w:shd w:fill="FFFFFF" w:color="auto" w:val="clear"/>
-            <w:tcMar>
-              <w:top w:type="dxa" w:w="56"/>
-              <w:left w:type="dxa" w:w="113"/>
-              <w:bottom w:type="dxa" w:w="56"/>
-              <w:right w:type="dxa" w:w="113"/>
-            </w:tcMar>
-          </w:tcPr>
-          <w:p>
-            <w:pPr>
-              <w:spacing w:after="0" w:before="0" w:line="252"/>
-            </w:pPr>
-            <w:r>
-              <w:rPr>
-                <w:rFonts w:ascii="Calibri" w:cs="Calibri" w:eastAsia="Calibri" w:hAnsi="Calibri"/>
-                <w:color w:val="2E2E2E"/>
-                <w:sz w:val="20"/>
-                <w:szCs w:val="20"/>
-              </w:rPr>
-              <w:t xml:space="preserve"/>
-            </w:r>
-          </w:p>
-        </w:tc>
-        <w:tc>
-          <w:tcPr>
-            <w:tcW w:type="dxa" w:w="1360"/>
-            <w:shd w:fill="FFFFFF" w:color="auto" w:val="clear"/>
-            <w:tcMar>
-              <w:top w:type="dxa" w:w="56"/>
-              <w:left w:type="dxa" w:w="113"/>
-              <w:bottom w:type="dxa" w:w="56"/>
-              <w:right w:type="dxa" w:w="113"/>
-            </w:tcMar>
-          </w:tcPr>
-          <w:p>
-            <w:pPr>
-              <w:spacing w:after="0" w:before="0" w:line="252"/>
-            </w:pPr>
-            <w:r>
-              <w:rPr>
-                <w:rFonts w:ascii="Calibri" w:cs="Calibri" w:eastAsia="Calibri" w:hAnsi="Calibri"/>
-                <w:color w:val="2E2E2E"/>
-                <w:sz w:val="20"/>
-                <w:szCs w:val="20"/>
-              </w:rPr>
-              <w:t xml:space="preserve"/>
-            </w:r>
-          </w:p>
-        </w:tc>
-        <w:tc>
-          <w:tcPr>
-            <w:tcW w:type="dxa" w:w="2381"/>
+            <w:tcW w:type="dxa" w:w="1474"/>
+            <w:shd w:fill="FFFFFF" w:color="auto" w:val="clear"/>
+            <w:tcMar>
+              <w:top w:type="dxa" w:w="56"/>
+              <w:left w:type="dxa" w:w="113"/>
+              <w:bottom w:type="dxa" w:w="56"/>
+              <w:right w:type="dxa" w:w="113"/>
+            </w:tcMar>
+          </w:tcPr>
+          <w:p>
+            <w:pPr>
+              <w:spacing w:after="0" w:before="0" w:line="252"/>
+            </w:pPr>
+            <w:r>
+              <w:rPr>
+                <w:rFonts w:ascii="Calibri" w:cs="Calibri" w:eastAsia="Calibri" w:hAnsi="Calibri"/>
+                <w:color w:val="2E2E2E"/>
+                <w:sz w:val="20"/>
+                <w:szCs w:val="20"/>
+              </w:rPr>
+              <w:t xml:space="preserve"/>
+            </w:r>
+          </w:p>
+        </w:tc>
+        <w:tc>
+          <w:tcPr>
+            <w:tcW w:type="dxa" w:w="1474"/>
+            <w:shd w:fill="FFFFFF" w:color="auto" w:val="clear"/>
+            <w:tcMar>
+              <w:top w:type="dxa" w:w="56"/>
+              <w:left w:type="dxa" w:w="113"/>
+              <w:bottom w:type="dxa" w:w="56"/>
+              <w:right w:type="dxa" w:w="113"/>
+            </w:tcMar>
+          </w:tcPr>
+          <w:p>
+            <w:pPr>
+              <w:spacing w:after="0" w:before="0" w:line="252"/>
+            </w:pPr>
+            <w:r>
+              <w:rPr>
+                <w:rFonts w:ascii="Calibri" w:cs="Calibri" w:eastAsia="Calibri" w:hAnsi="Calibri"/>
+                <w:color w:val="2E2E2E"/>
+                <w:sz w:val="20"/>
+                <w:szCs w:val="20"/>
+              </w:rPr>
+              <w:t xml:space="preserve"/>
+            </w:r>
+          </w:p>
+        </w:tc>
+        <w:tc>
+          <w:tcPr>
+            <w:tcW w:type="dxa" w:w="2154"/>
             <w:shd w:fill="FFFFFF" w:color="auto" w:val="clear"/>
             <w:tcMar>
               <w:top w:type="dxa" w:w="56"/>
@@ -2538,59 +2538,59 @@
         </w:tc>
         <w:tc>
           <w:tcPr>
-            <w:tcW w:type="dxa" w:w="1360"/>
-            <w:shd w:fill="FAFAF6" w:color="auto" w:val="clear"/>
-            <w:tcMar>
-              <w:top w:type="dxa" w:w="56"/>
-              <w:left w:type="dxa" w:w="113"/>
-              <w:bottom w:type="dxa" w:w="56"/>
-              <w:right w:type="dxa" w:w="113"/>
-            </w:tcMar>
-          </w:tcPr>
-          <w:p>
-            <w:pPr>
-              <w:spacing w:after="0" w:before="0" w:line="252"/>
-            </w:pPr>
-            <w:r>
-              <w:rPr>
-                <w:rFonts w:ascii="Calibri" w:cs="Calibri" w:eastAsia="Calibri" w:hAnsi="Calibri"/>
-                <w:color w:val="2E2E2E"/>
-                <w:sz w:val="20"/>
-                <w:szCs w:val="20"/>
-              </w:rPr>
-              <w:t xml:space="preserve"/>
-            </w:r>
-          </w:p>
-        </w:tc>
-        <w:tc>
-          <w:tcPr>
-            <w:tcW w:type="dxa" w:w="1360"/>
-            <w:shd w:fill="FAFAF6" w:color="auto" w:val="clear"/>
-            <w:tcMar>
-              <w:top w:type="dxa" w:w="56"/>
-              <w:left w:type="dxa" w:w="113"/>
-              <w:bottom w:type="dxa" w:w="56"/>
-              <w:right w:type="dxa" w:w="113"/>
-            </w:tcMar>
-          </w:tcPr>
-          <w:p>
-            <w:pPr>
-              <w:spacing w:after="0" w:before="0" w:line="252"/>
-            </w:pPr>
-            <w:r>
-              <w:rPr>
-                <w:rFonts w:ascii="Calibri" w:cs="Calibri" w:eastAsia="Calibri" w:hAnsi="Calibri"/>
-                <w:color w:val="2E2E2E"/>
-                <w:sz w:val="20"/>
-                <w:szCs w:val="20"/>
-              </w:rPr>
-              <w:t xml:space="preserve"/>
-            </w:r>
-          </w:p>
-        </w:tc>
-        <w:tc>
-          <w:tcPr>
-            <w:tcW w:type="dxa" w:w="2381"/>
+            <w:tcW w:type="dxa" w:w="1474"/>
+            <w:shd w:fill="FAFAF6" w:color="auto" w:val="clear"/>
+            <w:tcMar>
+              <w:top w:type="dxa" w:w="56"/>
+              <w:left w:type="dxa" w:w="113"/>
+              <w:bottom w:type="dxa" w:w="56"/>
+              <w:right w:type="dxa" w:w="113"/>
+            </w:tcMar>
+          </w:tcPr>
+          <w:p>
+            <w:pPr>
+              <w:spacing w:after="0" w:before="0" w:line="252"/>
+            </w:pPr>
+            <w:r>
+              <w:rPr>
+                <w:rFonts w:ascii="Calibri" w:cs="Calibri" w:eastAsia="Calibri" w:hAnsi="Calibri"/>
+                <w:color w:val="2E2E2E"/>
+                <w:sz w:val="20"/>
+                <w:szCs w:val="20"/>
+              </w:rPr>
+              <w:t xml:space="preserve"/>
+            </w:r>
+          </w:p>
+        </w:tc>
+        <w:tc>
+          <w:tcPr>
+            <w:tcW w:type="dxa" w:w="1474"/>
+            <w:shd w:fill="FAFAF6" w:color="auto" w:val="clear"/>
+            <w:tcMar>
+              <w:top w:type="dxa" w:w="56"/>
+              <w:left w:type="dxa" w:w="113"/>
+              <w:bottom w:type="dxa" w:w="56"/>
+              <w:right w:type="dxa" w:w="113"/>
+            </w:tcMar>
+          </w:tcPr>
+          <w:p>
+            <w:pPr>
+              <w:spacing w:after="0" w:before="0" w:line="252"/>
+            </w:pPr>
+            <w:r>
+              <w:rPr>
+                <w:rFonts w:ascii="Calibri" w:cs="Calibri" w:eastAsia="Calibri" w:hAnsi="Calibri"/>
+                <w:color w:val="2E2E2E"/>
+                <w:sz w:val="20"/>
+                <w:szCs w:val="20"/>
+              </w:rPr>
+              <w:t xml:space="preserve"/>
+            </w:r>
+          </w:p>
+        </w:tc>
+        <w:tc>
+          <w:tcPr>
+            <w:tcW w:type="dxa" w:w="2154"/>
             <w:shd w:fill="FAFAF6" w:color="auto" w:val="clear"/>
             <w:tcMar>
               <w:top w:type="dxa" w:w="56"/>
@@ -2751,59 +2751,59 @@
         </w:tc>
         <w:tc>
           <w:tcPr>
-            <w:tcW w:type="dxa" w:w="1360"/>
-            <w:shd w:fill="FFFFFF" w:color="auto" w:val="clear"/>
-            <w:tcMar>
-              <w:top w:type="dxa" w:w="56"/>
-              <w:left w:type="dxa" w:w="113"/>
-              <w:bottom w:type="dxa" w:w="56"/>
-              <w:right w:type="dxa" w:w="113"/>
-            </w:tcMar>
-          </w:tcPr>
-          <w:p>
-            <w:pPr>
-              <w:spacing w:after="0" w:before="0" w:line="252"/>
-            </w:pPr>
-            <w:r>
-              <w:rPr>
-                <w:rFonts w:ascii="Calibri" w:cs="Calibri" w:eastAsia="Calibri" w:hAnsi="Calibri"/>
-                <w:color w:val="2E2E2E"/>
-                <w:sz w:val="20"/>
-                <w:szCs w:val="20"/>
-              </w:rPr>
-              <w:t xml:space="preserve"/>
-            </w:r>
-          </w:p>
-        </w:tc>
-        <w:tc>
-          <w:tcPr>
-            <w:tcW w:type="dxa" w:w="1360"/>
-            <w:shd w:fill="FFFFFF" w:color="auto" w:val="clear"/>
-            <w:tcMar>
-              <w:top w:type="dxa" w:w="56"/>
-              <w:left w:type="dxa" w:w="113"/>
-              <w:bottom w:type="dxa" w:w="56"/>
-              <w:right w:type="dxa" w:w="113"/>
-            </w:tcMar>
-          </w:tcPr>
-          <w:p>
-            <w:pPr>
-              <w:spacing w:after="0" w:before="0" w:line="252"/>
-            </w:pPr>
-            <w:r>
-              <w:rPr>
-                <w:rFonts w:ascii="Calibri" w:cs="Calibri" w:eastAsia="Calibri" w:hAnsi="Calibri"/>
-                <w:color w:val="2E2E2E"/>
-                <w:sz w:val="20"/>
-                <w:szCs w:val="20"/>
-              </w:rPr>
-              <w:t xml:space="preserve"/>
-            </w:r>
-          </w:p>
-        </w:tc>
-        <w:tc>
-          <w:tcPr>
-            <w:tcW w:type="dxa" w:w="2381"/>
+            <w:tcW w:type="dxa" w:w="1474"/>
+            <w:shd w:fill="FFFFFF" w:color="auto" w:val="clear"/>
+            <w:tcMar>
+              <w:top w:type="dxa" w:w="56"/>
+              <w:left w:type="dxa" w:w="113"/>
+              <w:bottom w:type="dxa" w:w="56"/>
+              <w:right w:type="dxa" w:w="113"/>
+            </w:tcMar>
+          </w:tcPr>
+          <w:p>
+            <w:pPr>
+              <w:spacing w:after="0" w:before="0" w:line="252"/>
+            </w:pPr>
+            <w:r>
+              <w:rPr>
+                <w:rFonts w:ascii="Calibri" w:cs="Calibri" w:eastAsia="Calibri" w:hAnsi="Calibri"/>
+                <w:color w:val="2E2E2E"/>
+                <w:sz w:val="20"/>
+                <w:szCs w:val="20"/>
+              </w:rPr>
+              <w:t xml:space="preserve"/>
+            </w:r>
+          </w:p>
+        </w:tc>
+        <w:tc>
+          <w:tcPr>
+            <w:tcW w:type="dxa" w:w="1474"/>
+            <w:shd w:fill="FFFFFF" w:color="auto" w:val="clear"/>
+            <w:tcMar>
+              <w:top w:type="dxa" w:w="56"/>
+              <w:left w:type="dxa" w:w="113"/>
+              <w:bottom w:type="dxa" w:w="56"/>
+              <w:right w:type="dxa" w:w="113"/>
+            </w:tcMar>
+          </w:tcPr>
+          <w:p>
+            <w:pPr>
+              <w:spacing w:after="0" w:before="0" w:line="252"/>
+            </w:pPr>
+            <w:r>
+              <w:rPr>
+                <w:rFonts w:ascii="Calibri" w:cs="Calibri" w:eastAsia="Calibri" w:hAnsi="Calibri"/>
+                <w:color w:val="2E2E2E"/>
+                <w:sz w:val="20"/>
+                <w:szCs w:val="20"/>
+              </w:rPr>
+              <w:t xml:space="preserve"/>
+            </w:r>
+          </w:p>
+        </w:tc>
+        <w:tc>
+          <w:tcPr>
+            <w:tcW w:type="dxa" w:w="2154"/>
             <w:shd w:fill="FFFFFF" w:color="auto" w:val="clear"/>
             <w:tcMar>
               <w:top w:type="dxa" w:w="56"/>
@@ -2964,59 +2964,59 @@
         </w:tc>
         <w:tc>
           <w:tcPr>
-            <w:tcW w:type="dxa" w:w="1360"/>
-            <w:shd w:fill="FAFAF6" w:color="auto" w:val="clear"/>
-            <w:tcMar>
-              <w:top w:type="dxa" w:w="56"/>
-              <w:left w:type="dxa" w:w="113"/>
-              <w:bottom w:type="dxa" w:w="56"/>
-              <w:right w:type="dxa" w:w="113"/>
-            </w:tcMar>
-          </w:tcPr>
-          <w:p>
-            <w:pPr>
-              <w:spacing w:after="0" w:before="0" w:line="252"/>
-            </w:pPr>
-            <w:r>
-              <w:rPr>
-                <w:rFonts w:ascii="Calibri" w:cs="Calibri" w:eastAsia="Calibri" w:hAnsi="Calibri"/>
-                <w:color w:val="2E2E2E"/>
-                <w:sz w:val="20"/>
-                <w:szCs w:val="20"/>
-              </w:rPr>
-              <w:t xml:space="preserve"/>
-            </w:r>
-          </w:p>
-        </w:tc>
-        <w:tc>
-          <w:tcPr>
-            <w:tcW w:type="dxa" w:w="1360"/>
-            <w:shd w:fill="FAFAF6" w:color="auto" w:val="clear"/>
-            <w:tcMar>
-              <w:top w:type="dxa" w:w="56"/>
-              <w:left w:type="dxa" w:w="113"/>
-              <w:bottom w:type="dxa" w:w="56"/>
-              <w:right w:type="dxa" w:w="113"/>
-            </w:tcMar>
-          </w:tcPr>
-          <w:p>
-            <w:pPr>
-              <w:spacing w:after="0" w:before="0" w:line="252"/>
-            </w:pPr>
-            <w:r>
-              <w:rPr>
-                <w:rFonts w:ascii="Calibri" w:cs="Calibri" w:eastAsia="Calibri" w:hAnsi="Calibri"/>
-                <w:color w:val="2E2E2E"/>
-                <w:sz w:val="20"/>
-                <w:szCs w:val="20"/>
-              </w:rPr>
-              <w:t xml:space="preserve"/>
-            </w:r>
-          </w:p>
-        </w:tc>
-        <w:tc>
-          <w:tcPr>
-            <w:tcW w:type="dxa" w:w="2381"/>
+            <w:tcW w:type="dxa" w:w="1474"/>
+            <w:shd w:fill="FAFAF6" w:color="auto" w:val="clear"/>
+            <w:tcMar>
+              <w:top w:type="dxa" w:w="56"/>
+              <w:left w:type="dxa" w:w="113"/>
+              <w:bottom w:type="dxa" w:w="56"/>
+              <w:right w:type="dxa" w:w="113"/>
+            </w:tcMar>
+          </w:tcPr>
+          <w:p>
+            <w:pPr>
+              <w:spacing w:after="0" w:before="0" w:line="252"/>
+            </w:pPr>
+            <w:r>
+              <w:rPr>
+                <w:rFonts w:ascii="Calibri" w:cs="Calibri" w:eastAsia="Calibri" w:hAnsi="Calibri"/>
+                <w:color w:val="2E2E2E"/>
+                <w:sz w:val="20"/>
+                <w:szCs w:val="20"/>
+              </w:rPr>
+              <w:t xml:space="preserve"/>
+            </w:r>
+          </w:p>
+        </w:tc>
+        <w:tc>
+          <w:tcPr>
+            <w:tcW w:type="dxa" w:w="1474"/>
+            <w:shd w:fill="FAFAF6" w:color="auto" w:val="clear"/>
+            <w:tcMar>
+              <w:top w:type="dxa" w:w="56"/>
+              <w:left w:type="dxa" w:w="113"/>
+              <w:bottom w:type="dxa" w:w="56"/>
+              <w:right w:type="dxa" w:w="113"/>
+            </w:tcMar>
+          </w:tcPr>
+          <w:p>
+            <w:pPr>
+              <w:spacing w:after="0" w:before="0" w:line="252"/>
+            </w:pPr>
+            <w:r>
+              <w:rPr>
+                <w:rFonts w:ascii="Calibri" w:cs="Calibri" w:eastAsia="Calibri" w:hAnsi="Calibri"/>
+                <w:color w:val="2E2E2E"/>
+                <w:sz w:val="20"/>
+                <w:szCs w:val="20"/>
+              </w:rPr>
+              <w:t xml:space="preserve"/>
+            </w:r>
+          </w:p>
+        </w:tc>
+        <w:tc>
+          <w:tcPr>
+            <w:tcW w:type="dxa" w:w="2154"/>
             <w:shd w:fill="FAFAF6" w:color="auto" w:val="clear"/>
             <w:tcMar>
               <w:top w:type="dxa" w:w="56"/>
@@ -3177,59 +3177,59 @@
         </w:tc>
         <w:tc>
           <w:tcPr>
-            <w:tcW w:type="dxa" w:w="1360"/>
-            <w:shd w:fill="FFFFFF" w:color="auto" w:val="clear"/>
-            <w:tcMar>
-              <w:top w:type="dxa" w:w="56"/>
-              <w:left w:type="dxa" w:w="113"/>
-              <w:bottom w:type="dxa" w:w="56"/>
-              <w:right w:type="dxa" w:w="113"/>
-            </w:tcMar>
-          </w:tcPr>
-          <w:p>
-            <w:pPr>
-              <w:spacing w:after="0" w:before="0" w:line="252"/>
-            </w:pPr>
-            <w:r>
-              <w:rPr>
-                <w:rFonts w:ascii="Calibri" w:cs="Calibri" w:eastAsia="Calibri" w:hAnsi="Calibri"/>
-                <w:color w:val="2E2E2E"/>
-                <w:sz w:val="20"/>
-                <w:szCs w:val="20"/>
-              </w:rPr>
-              <w:t xml:space="preserve"/>
-            </w:r>
-          </w:p>
-        </w:tc>
-        <w:tc>
-          <w:tcPr>
-            <w:tcW w:type="dxa" w:w="1360"/>
-            <w:shd w:fill="FFFFFF" w:color="auto" w:val="clear"/>
-            <w:tcMar>
-              <w:top w:type="dxa" w:w="56"/>
-              <w:left w:type="dxa" w:w="113"/>
-              <w:bottom w:type="dxa" w:w="56"/>
-              <w:right w:type="dxa" w:w="113"/>
-            </w:tcMar>
-          </w:tcPr>
-          <w:p>
-            <w:pPr>
-              <w:spacing w:after="0" w:before="0" w:line="252"/>
-            </w:pPr>
-            <w:r>
-              <w:rPr>
-                <w:rFonts w:ascii="Calibri" w:cs="Calibri" w:eastAsia="Calibri" w:hAnsi="Calibri"/>
-                <w:color w:val="2E2E2E"/>
-                <w:sz w:val="20"/>
-                <w:szCs w:val="20"/>
-              </w:rPr>
-              <w:t xml:space="preserve"/>
-            </w:r>
-          </w:p>
-        </w:tc>
-        <w:tc>
-          <w:tcPr>
-            <w:tcW w:type="dxa" w:w="2381"/>
+            <w:tcW w:type="dxa" w:w="1474"/>
+            <w:shd w:fill="FFFFFF" w:color="auto" w:val="clear"/>
+            <w:tcMar>
+              <w:top w:type="dxa" w:w="56"/>
+              <w:left w:type="dxa" w:w="113"/>
+              <w:bottom w:type="dxa" w:w="56"/>
+              <w:right w:type="dxa" w:w="113"/>
+            </w:tcMar>
+          </w:tcPr>
+          <w:p>
+            <w:pPr>
+              <w:spacing w:after="0" w:before="0" w:line="252"/>
+            </w:pPr>
+            <w:r>
+              <w:rPr>
+                <w:rFonts w:ascii="Calibri" w:cs="Calibri" w:eastAsia="Calibri" w:hAnsi="Calibri"/>
+                <w:color w:val="2E2E2E"/>
+                <w:sz w:val="20"/>
+                <w:szCs w:val="20"/>
+              </w:rPr>
+              <w:t xml:space="preserve"/>
+            </w:r>
+          </w:p>
+        </w:tc>
+        <w:tc>
+          <w:tcPr>
+            <w:tcW w:type="dxa" w:w="1474"/>
+            <w:shd w:fill="FFFFFF" w:color="auto" w:val="clear"/>
+            <w:tcMar>
+              <w:top w:type="dxa" w:w="56"/>
+              <w:left w:type="dxa" w:w="113"/>
+              <w:bottom w:type="dxa" w:w="56"/>
+              <w:right w:type="dxa" w:w="113"/>
+            </w:tcMar>
+          </w:tcPr>
+          <w:p>
+            <w:pPr>
+              <w:spacing w:after="0" w:before="0" w:line="252"/>
+            </w:pPr>
+            <w:r>
+              <w:rPr>
+                <w:rFonts w:ascii="Calibri" w:cs="Calibri" w:eastAsia="Calibri" w:hAnsi="Calibri"/>
+                <w:color w:val="2E2E2E"/>
+                <w:sz w:val="20"/>
+                <w:szCs w:val="20"/>
+              </w:rPr>
+              <w:t xml:space="preserve"/>
+            </w:r>
+          </w:p>
+        </w:tc>
+        <w:tc>
+          <w:tcPr>
+            <w:tcW w:type="dxa" w:w="2154"/>
             <w:shd w:fill="FFFFFF" w:color="auto" w:val="clear"/>
             <w:tcMar>
               <w:top w:type="dxa" w:w="56"/>
@@ -3257,8 +3257,28 @@
     </w:tbl>
     <w:p>
       <w:pPr>
-        <w:spacing w:after="0" w:before="90" w:line="252"/>
+        <w:spacing w:after="0" w:before="80" w:line="252"/>
       </w:pPr>
+      <w:r>
+        <w:rPr>
+          <w:rFonts w:ascii="Calibri" w:cs="Calibri" w:eastAsia="Calibri" w:hAnsi="Calibri"/>
+          <w:b/>
+          <w:bCs/>
+          <w:color w:val="2E2E2E"/>
+          <w:sz w:val="20"/>
+          <w:szCs w:val="20"/>
+        </w:rPr>
+        <w:t xml:space="preserve">Le tarif que vous indiquez est votre honoraire. </w:t>
+      </w:r>
+      <w:r>
+        <w:rPr>
+          <w:rFonts w:ascii="Calibri" w:cs="Calibri" w:eastAsia="Calibri" w:hAnsi="Calibri"/>
+          <w:color w:val="2E2E2E"/>
+          <w:sz w:val="19"/>
+          <w:szCs w:val="19"/>
+        </w:rPr>
+        <w:t xml:space="preserve">Le terrain coûte </w:t>
+      </w:r>
       <w:r>
         <w:rPr>
           <w:rFonts w:ascii="Calibri" w:cs="Calibri" w:eastAsia="Calibri" w:hAnsi="Calibri"/>
@@ -3268,7 +3288,7 @@
           <w:sz w:val="20"/>
           <w:szCs w:val="20"/>
         </w:rPr>
-        <w:t xml:space="preserve">Prix du terrain : 15 € de l’heure</w:t>
+        <w:t xml:space="preserve">15 € de l’heure en plus</w:t>
       </w:r>
       <w:r>
         <w:rPr>
@@ -3277,7 +3297,7 @@
           <w:sz w:val="19"/>
           <w:szCs w:val="19"/>
         </w:rPr>
-        <w:t xml:space="preserve">  ·  à remettre en cash, sous enveloppe, à l’école à la fin du mois, avec votre nom et le nombre d’heures jouées.</w:t>
+        <w:t xml:space="preserve"> : l’élève paie votre tarif + 15 €. Vous remettez ces 15 € en cash, sous enveloppe, à l’école à la fin du mois, avec votre nom et le nombre d’heures jouées.</w:t>
       </w:r>
     </w:p>
     <w:sectPr>

</xml_diff>

<commit_message>
Applique les corrections relevées sur la liste des cours privés
Mario Loyo passe à dix ans d'expérience et reçoit ses langues, et le
numéro de Jad Lamaizi est corrigé. Les autres lectures incertaines —
l'âge de Jérémie Saoul, l'expérience de Mourad Houmid Bennani, le
numéro de Taha Yassine et le niveau de Yassine Cherqi — sont confirmées
telles quelles.

Co-Authored-By: Claude Opus 5 <noreply@anthropic.com>
Claude-Session: https://claude.ai/code/session_01RsDkbcD3KwyPviDTcs72WZ
</commit_message>
<xml_diff>
--- a/Cours_prives_liste_moniteurs.docx
+++ b/Cours_prives_liste_moniteurs.docx
@@ -2421,7 +2421,7 @@
                 <w:sz w:val="18"/>
                 <w:szCs w:val="18"/>
               </w:rPr>
-              <w:t xml:space="preserve">0452 65 01 89</w:t>
+              <w:t xml:space="preserve">0492 65 01 89</w:t>
             </w:r>
           </w:p>
         </w:tc>
@@ -2752,7 +2752,7 @@
                 <w:sz w:val="18"/>
                 <w:szCs w:val="18"/>
               </w:rPr>
-              <w:t xml:space="preserve">46</w:t>
+              <w:t xml:space="preserve">10</w:t>
             </w:r>
           </w:p>
         </w:tc>
@@ -2841,7 +2841,7 @@
                 <w:sz w:val="18"/>
                 <w:szCs w:val="18"/>
               </w:rPr>
-              <w:t xml:space="preserve">—</w:t>
+              <w:t xml:space="preserve">FR · ES</w:t>
             </w:r>
           </w:p>
         </w:tc>

</xml_diff>

<commit_message>
Harmonise les niveaux de formation sur la nomenclature actuelle
Animateur devient le 1er niveau, Initiateur le 2e et Éducateur le 3e.
Les moniteurs ayant inscrit l'ancienne appellation sont convertis :
« niveau 1 » correspondait à Initiateur et « niveau 2 » à Éducateur,
ce qui place Yassine Cherqi au 3e niveau. Une légende sous le tableau
rappelle la correspondance.

Co-Authored-By: Claude Opus 5 <noreply@anthropic.com>
Claude-Session: https://claude.ai/code/session_01RsDkbcD3KwyPviDTcs72WZ
</commit_message>
<xml_diff>
--- a/Cours_prives_liste_moniteurs.docx
+++ b/Cours_prives_liste_moniteurs.docx
@@ -514,7 +514,7 @@
                 <w:sz w:val="18"/>
                 <w:szCs w:val="18"/>
               </w:rPr>
-              <w:t xml:space="preserve">Animateur</w:t>
+              <w:t xml:space="preserve">Animateur (1er niveau)</w:t>
             </w:r>
           </w:p>
         </w:tc>
@@ -756,7 +756,7 @@
                 <w:sz w:val="18"/>
                 <w:szCs w:val="18"/>
               </w:rPr>
-              <w:t xml:space="preserve">Animateur</w:t>
+              <w:t xml:space="preserve">Animateur (1er niveau)</w:t>
             </w:r>
           </w:p>
         </w:tc>
@@ -998,7 +998,7 @@
                 <w:sz w:val="18"/>
                 <w:szCs w:val="18"/>
               </w:rPr>
-              <w:t xml:space="preserve">Niveau 2</w:t>
+              <w:t xml:space="preserve">Éducateur (3e niveau)</w:t>
             </w:r>
           </w:p>
         </w:tc>
@@ -1240,7 +1240,7 @@
                 <w:sz w:val="18"/>
                 <w:szCs w:val="18"/>
               </w:rPr>
-              <w:t xml:space="preserve">Initiateur (niveau 1)</w:t>
+              <w:t xml:space="preserve">Initiateur (2e niveau)</w:t>
             </w:r>
           </w:p>
         </w:tc>
@@ -1482,7 +1482,7 @@
                 <w:sz w:val="18"/>
                 <w:szCs w:val="18"/>
               </w:rPr>
-              <w:t xml:space="preserve">Initiateur (niveau 1)</w:t>
+              <w:t xml:space="preserve">Initiateur (2e niveau)</w:t>
             </w:r>
           </w:p>
         </w:tc>
@@ -1724,7 +1724,7 @@
                 <w:sz w:val="18"/>
                 <w:szCs w:val="18"/>
               </w:rPr>
-              <w:t xml:space="preserve">Animateur</w:t>
+              <w:t xml:space="preserve">Animateur (1er niveau)</w:t>
             </w:r>
           </w:p>
         </w:tc>
@@ -1966,7 +1966,7 @@
                 <w:sz w:val="18"/>
                 <w:szCs w:val="18"/>
               </w:rPr>
-              <w:t xml:space="preserve">Animateur</w:t>
+              <w:t xml:space="preserve">Animateur (1er niveau)</w:t>
             </w:r>
           </w:p>
         </w:tc>
@@ -2208,7 +2208,7 @@
                 <w:sz w:val="18"/>
                 <w:szCs w:val="18"/>
               </w:rPr>
-              <w:t xml:space="preserve">Niveau 1</w:t>
+              <w:t xml:space="preserve">Initiateur (2e niveau)</w:t>
             </w:r>
           </w:p>
         </w:tc>
@@ -2450,7 +2450,7 @@
                 <w:sz w:val="18"/>
                 <w:szCs w:val="18"/>
               </w:rPr>
-              <w:t xml:space="preserve">Animateur</w:t>
+              <w:t xml:space="preserve">Animateur (1er niveau)</w:t>
             </w:r>
           </w:p>
         </w:tc>
@@ -2692,7 +2692,7 @@
                 <w:sz w:val="18"/>
                 <w:szCs w:val="18"/>
               </w:rPr>
-              <w:t xml:space="preserve">Animateur +</w:t>
+              <w:t xml:space="preserve">Animateur (1er niveau)</w:t>
             </w:r>
           </w:p>
         </w:tc>
@@ -2934,7 +2934,7 @@
                 <w:sz w:val="18"/>
                 <w:szCs w:val="18"/>
               </w:rPr>
-              <w:t xml:space="preserve">Initiateur (niveau 1)</w:t>
+              <w:t xml:space="preserve">Initiateur (2e niveau)</w:t>
             </w:r>
           </w:p>
         </w:tc>
@@ -3176,7 +3176,7 @@
                 <w:sz w:val="18"/>
                 <w:szCs w:val="18"/>
               </w:rPr>
-              <w:t xml:space="preserve">Animateur</w:t>
+              <w:t xml:space="preserve">Animateur (1er niveau)</w:t>
             </w:r>
           </w:p>
         </w:tc>
@@ -3418,7 +3418,7 @@
                 <w:sz w:val="18"/>
                 <w:szCs w:val="18"/>
               </w:rPr>
-              <w:t xml:space="preserve">Initiateur (niveau 1)</w:t>
+              <w:t xml:space="preserve">Initiateur (2e niveau)</w:t>
             </w:r>
           </w:p>
         </w:tc>
@@ -3660,7 +3660,7 @@
                 <w:sz w:val="18"/>
                 <w:szCs w:val="18"/>
               </w:rPr>
-              <w:t xml:space="preserve">Animateur</w:t>
+              <w:t xml:space="preserve">Animateur (1er niveau)</w:t>
             </w:r>
           </w:p>
         </w:tc>
@@ -3902,7 +3902,7 @@
                 <w:sz w:val="18"/>
                 <w:szCs w:val="18"/>
               </w:rPr>
-              <w:t xml:space="preserve">Animateur</w:t>
+              <w:t xml:space="preserve">Animateur (1er niveau)</w:t>
             </w:r>
           </w:p>
         </w:tc>
@@ -4100,6 +4100,31 @@
           <w:szCs w:val="19"/>
         </w:rPr>
         <w:t xml:space="preserve"> : l’élève paie le tarif du moniteur + 17 €. Le moniteur remet ces 17 € en cash, sous enveloppe, à l’école à la fin du mois, avec son nom et le nombre d’heures jouées.</w:t>
+      </w:r>
+    </w:p>
+    <w:p>
+      <w:pPr>
+        <w:spacing w:after="40" w:before="60" w:line="230"/>
+      </w:pPr>
+      <w:r>
+        <w:rPr>
+          <w:rFonts w:ascii="Calibri" w:cs="Calibri" w:eastAsia="Calibri" w:hAnsi="Calibri"/>
+          <w:b/>
+          <w:bCs/>
+          <w:color w:val="6E6E6E"/>
+          <w:sz w:val="17"/>
+          <w:szCs w:val="17"/>
+        </w:rPr>
+        <w:t xml:space="preserve">Niveaux de formation : </w:t>
+      </w:r>
+      <w:r>
+        <w:rPr>
+          <w:rFonts w:ascii="Calibri" w:cs="Calibri" w:eastAsia="Calibri" w:hAnsi="Calibri"/>
+          <w:color w:val="6E6E6E"/>
+          <w:sz w:val="17"/>
+          <w:szCs w:val="17"/>
+        </w:rPr>
+        <w:t xml:space="preserve">Animateur (1er niveau)  ·  Initiateur (2e niveau)  ·  Éducateur (3e niveau)</w:t>
       </w:r>
     </w:p>
     <w:p>

</xml_diff>

<commit_message>
Classe les moniteurs par niveau de formation décroissant
L'éducateur vient d'abord, puis les initiateurs et les animateurs,
chaque groupe étant trié par ordre alphabétique.

Co-Authored-By: Claude Opus 5 <noreply@anthropic.com>
Claude-Session: https://claude.ai/code/session_01RsDkbcD3KwyPviDTcs72WZ
</commit_message>
<xml_diff>
--- a/Cours_prives_liste_moniteurs.docx
+++ b/Cours_prives_liste_moniteurs.docx
@@ -456,7 +456,7 @@
                 <w:sz w:val="18"/>
                 <w:szCs w:val="18"/>
               </w:rPr>
-              <w:t xml:space="preserve">BEDORET Frédéric</w:t>
+              <w:t xml:space="preserve">CHERQI Yassine</w:t>
             </w:r>
           </w:p>
         </w:tc>
@@ -485,7 +485,7 @@
                 <w:sz w:val="18"/>
                 <w:szCs w:val="18"/>
               </w:rPr>
-              <w:t xml:space="preserve">0478 93 62 09</w:t>
+              <w:t xml:space="preserve">0474 36 13 14</w:t>
             </w:r>
           </w:p>
         </w:tc>
@@ -514,7 +514,7 @@
                 <w:sz w:val="18"/>
                 <w:szCs w:val="18"/>
               </w:rPr>
-              <w:t xml:space="preserve">Animateur (1er niveau)</w:t>
+              <w:t xml:space="preserve">Éducateur (3e niveau)</w:t>
             </w:r>
           </w:p>
         </w:tc>
@@ -544,7 +544,7 @@
                 <w:sz w:val="18"/>
                 <w:szCs w:val="18"/>
               </w:rPr>
-              <w:t xml:space="preserve">47</w:t>
+              <w:t xml:space="preserve">48</w:t>
             </w:r>
           </w:p>
         </w:tc>
@@ -574,7 +574,7 @@
                 <w:sz w:val="18"/>
                 <w:szCs w:val="18"/>
               </w:rPr>
-              <w:t xml:space="preserve">1</w:t>
+              <w:t xml:space="preserve">26</w:t>
             </w:r>
           </w:p>
         </w:tc>
@@ -604,7 +604,7 @@
                 <w:sz w:val="18"/>
                 <w:szCs w:val="18"/>
               </w:rPr>
-              <w:t xml:space="preserve">35 €</w:t>
+              <w:t xml:space="preserve">45 €</w:t>
             </w:r>
           </w:p>
         </w:tc>
@@ -634,7 +634,7 @@
                 <w:sz w:val="18"/>
                 <w:szCs w:val="18"/>
               </w:rPr>
-              <w:t xml:space="preserve">35 €</w:t>
+              <w:t xml:space="preserve">45 €</w:t>
             </w:r>
           </w:p>
         </w:tc>
@@ -663,7 +663,7 @@
                 <w:sz w:val="18"/>
                 <w:szCs w:val="18"/>
               </w:rPr>
-              <w:t xml:space="preserve">FR · EN · NL</w:t>
+              <w:t xml:space="preserve">FR · EN · ES · Arabe</w:t>
             </w:r>
           </w:p>
         </w:tc>
@@ -698,7 +698,7 @@
                 <w:sz w:val="18"/>
                 <w:szCs w:val="18"/>
               </w:rPr>
-              <w:t xml:space="preserve">CELIK Alpaslan</w:t>
+              <w:t xml:space="preserve">CHIBLI Julien</w:t>
             </w:r>
           </w:p>
         </w:tc>
@@ -727,7 +727,7 @@
                 <w:sz w:val="18"/>
                 <w:szCs w:val="18"/>
               </w:rPr>
-              <w:t xml:space="preserve">0484 53 89 23</w:t>
+              <w:t xml:space="preserve">0470 09 12 62</w:t>
             </w:r>
           </w:p>
         </w:tc>
@@ -756,7 +756,7 @@
                 <w:sz w:val="18"/>
                 <w:szCs w:val="18"/>
               </w:rPr>
-              <w:t xml:space="preserve">Animateur (1er niveau)</w:t>
+              <w:t xml:space="preserve">Initiateur (2e niveau)</w:t>
             </w:r>
           </w:p>
         </w:tc>
@@ -786,7 +786,7 @@
                 <w:sz w:val="18"/>
                 <w:szCs w:val="18"/>
               </w:rPr>
-              <w:t xml:space="preserve">43</w:t>
+              <w:t xml:space="preserve">26</w:t>
             </w:r>
           </w:p>
         </w:tc>
@@ -816,7 +816,7 @@
                 <w:sz w:val="18"/>
                 <w:szCs w:val="18"/>
               </w:rPr>
-              <w:t xml:space="preserve">18</w:t>
+              <w:t xml:space="preserve">11</w:t>
             </w:r>
           </w:p>
         </w:tc>
@@ -846,7 +846,7 @@
                 <w:sz w:val="18"/>
                 <w:szCs w:val="18"/>
               </w:rPr>
-              <w:t xml:space="preserve">40 €</w:t>
+              <w:t xml:space="preserve">45 €</w:t>
             </w:r>
           </w:p>
         </w:tc>
@@ -876,7 +876,7 @@
                 <w:sz w:val="18"/>
                 <w:szCs w:val="18"/>
               </w:rPr>
-              <w:t xml:space="preserve">50 €</w:t>
+              <w:t xml:space="preserve">60 €</w:t>
             </w:r>
           </w:p>
         </w:tc>
@@ -905,7 +905,7 @@
                 <w:sz w:val="18"/>
                 <w:szCs w:val="18"/>
               </w:rPr>
-              <w:t xml:space="preserve">FR · NL · EN · Turc</w:t>
+              <w:t xml:space="preserve">FR · EN</w:t>
             </w:r>
           </w:p>
         </w:tc>
@@ -940,7 +940,7 @@
                 <w:sz w:val="18"/>
                 <w:szCs w:val="18"/>
               </w:rPr>
-              <w:t xml:space="preserve">CHERQI Yassine</w:t>
+              <w:t xml:space="preserve">DENIS Pascal</w:t>
             </w:r>
           </w:p>
         </w:tc>
@@ -969,7 +969,7 @@
                 <w:sz w:val="18"/>
                 <w:szCs w:val="18"/>
               </w:rPr>
-              <w:t xml:space="preserve">0474 36 13 14</w:t>
+              <w:t xml:space="preserve">0479 09 60 87</w:t>
             </w:r>
           </w:p>
         </w:tc>
@@ -998,7 +998,7 @@
                 <w:sz w:val="18"/>
                 <w:szCs w:val="18"/>
               </w:rPr>
-              <w:t xml:space="preserve">Éducateur (3e niveau)</w:t>
+              <w:t xml:space="preserve">Initiateur (2e niveau)</w:t>
             </w:r>
           </w:p>
         </w:tc>
@@ -1028,7 +1028,7 @@
                 <w:sz w:val="18"/>
                 <w:szCs w:val="18"/>
               </w:rPr>
-              <w:t xml:space="preserve">48</w:t>
+              <w:t xml:space="preserve">52</w:t>
             </w:r>
           </w:p>
         </w:tc>
@@ -1058,7 +1058,7 @@
                 <w:sz w:val="18"/>
                 <w:szCs w:val="18"/>
               </w:rPr>
-              <w:t xml:space="preserve">26</w:t>
+              <w:t xml:space="preserve">5</w:t>
             </w:r>
           </w:p>
         </w:tc>
@@ -1088,7 +1088,7 @@
                 <w:sz w:val="18"/>
                 <w:szCs w:val="18"/>
               </w:rPr>
-              <w:t xml:space="preserve">45 €</w:t>
+              <w:t xml:space="preserve">40 €</w:t>
             </w:r>
           </w:p>
         </w:tc>
@@ -1118,7 +1118,7 @@
                 <w:sz w:val="18"/>
                 <w:szCs w:val="18"/>
               </w:rPr>
-              <w:t xml:space="preserve">45 €</w:t>
+              <w:t xml:space="preserve">40 €</w:t>
             </w:r>
           </w:p>
         </w:tc>
@@ -1147,7 +1147,7 @@
                 <w:sz w:val="18"/>
                 <w:szCs w:val="18"/>
               </w:rPr>
-              <w:t xml:space="preserve">FR · EN · ES · Arabe</w:t>
+              <w:t xml:space="preserve">FR · EN</w:t>
             </w:r>
           </w:p>
         </w:tc>
@@ -1182,7 +1182,7 @@
                 <w:sz w:val="18"/>
                 <w:szCs w:val="18"/>
               </w:rPr>
-              <w:t xml:space="preserve">CHIBLI Julien</w:t>
+              <w:t xml:space="preserve">HOUMID BENNANI Mourad</w:t>
             </w:r>
           </w:p>
         </w:tc>
@@ -1211,7 +1211,7 @@
                 <w:sz w:val="18"/>
                 <w:szCs w:val="18"/>
               </w:rPr>
-              <w:t xml:space="preserve">0470 09 12 62</w:t>
+              <w:t xml:space="preserve">0489 23 33 19</w:t>
             </w:r>
           </w:p>
         </w:tc>
@@ -1270,7 +1270,7 @@
                 <w:sz w:val="18"/>
                 <w:szCs w:val="18"/>
               </w:rPr>
-              <w:t xml:space="preserve">26</w:t>
+              <w:t xml:space="preserve">50</w:t>
             </w:r>
           </w:p>
         </w:tc>
@@ -1300,7 +1300,7 @@
                 <w:sz w:val="18"/>
                 <w:szCs w:val="18"/>
               </w:rPr>
-              <w:t xml:space="preserve">11</w:t>
+              <w:t xml:space="preserve">23</w:t>
             </w:r>
           </w:p>
         </w:tc>
@@ -1330,7 +1330,7 @@
                 <w:sz w:val="18"/>
                 <w:szCs w:val="18"/>
               </w:rPr>
-              <w:t xml:space="preserve">45 €</w:t>
+              <w:t xml:space="preserve">50 €</w:t>
             </w:r>
           </w:p>
         </w:tc>
@@ -1360,7 +1360,7 @@
                 <w:sz w:val="18"/>
                 <w:szCs w:val="18"/>
               </w:rPr>
-              <w:t xml:space="preserve">60 €</w:t>
+              <w:t xml:space="preserve">50 €</w:t>
             </w:r>
           </w:p>
         </w:tc>
@@ -1389,7 +1389,7 @@
                 <w:sz w:val="18"/>
                 <w:szCs w:val="18"/>
               </w:rPr>
-              <w:t xml:space="preserve">FR · EN</w:t>
+              <w:t xml:space="preserve">—</w:t>
             </w:r>
           </w:p>
         </w:tc>
@@ -1424,7 +1424,7 @@
                 <w:sz w:val="18"/>
                 <w:szCs w:val="18"/>
               </w:rPr>
-              <w:t xml:space="preserve">DENIS Pascal</w:t>
+              <w:t xml:space="preserve">SAOUL Jérémie</w:t>
             </w:r>
           </w:p>
         </w:tc>
@@ -1453,7 +1453,7 @@
                 <w:sz w:val="18"/>
                 <w:szCs w:val="18"/>
               </w:rPr>
-              <w:t xml:space="preserve">0479 09 60 87</w:t>
+              <w:t xml:space="preserve">0474 64 40 04</w:t>
             </w:r>
           </w:p>
         </w:tc>
@@ -1512,7 +1512,7 @@
                 <w:sz w:val="18"/>
                 <w:szCs w:val="18"/>
               </w:rPr>
-              <w:t xml:space="preserve">52</w:t>
+              <w:t xml:space="preserve">23</w:t>
             </w:r>
           </w:p>
         </w:tc>
@@ -1542,7 +1542,7 @@
                 <w:sz w:val="18"/>
                 <w:szCs w:val="18"/>
               </w:rPr>
-              <w:t xml:space="preserve">5</w:t>
+              <w:t xml:space="preserve">2</w:t>
             </w:r>
           </w:p>
         </w:tc>
@@ -1631,7 +1631,7 @@
                 <w:sz w:val="18"/>
                 <w:szCs w:val="18"/>
               </w:rPr>
-              <w:t xml:space="preserve">FR · EN</w:t>
+              <w:t xml:space="preserve">FR · NL · EN</w:t>
             </w:r>
           </w:p>
         </w:tc>
@@ -1666,7 +1666,7 @@
                 <w:sz w:val="18"/>
                 <w:szCs w:val="18"/>
               </w:rPr>
-              <w:t xml:space="preserve">ERYILMAZ Zeliha</w:t>
+              <w:t xml:space="preserve">TAIEB Elias</w:t>
             </w:r>
           </w:p>
         </w:tc>
@@ -1695,7 +1695,7 @@
                 <w:sz w:val="18"/>
                 <w:szCs w:val="18"/>
               </w:rPr>
-              <w:t xml:space="preserve">0488 57 23 80</w:t>
+              <w:t xml:space="preserve">0493 21 94 47</w:t>
             </w:r>
           </w:p>
         </w:tc>
@@ -1724,7 +1724,7 @@
                 <w:sz w:val="18"/>
                 <w:szCs w:val="18"/>
               </w:rPr>
-              <w:t xml:space="preserve">Animateur (1er niveau)</w:t>
+              <w:t xml:space="preserve">Initiateur (2e niveau)</w:t>
             </w:r>
           </w:p>
         </w:tc>
@@ -1754,7 +1754,7 @@
                 <w:sz w:val="18"/>
                 <w:szCs w:val="18"/>
               </w:rPr>
-              <w:t xml:space="preserve">21</w:t>
+              <w:t xml:space="preserve">27</w:t>
             </w:r>
           </w:p>
         </w:tc>
@@ -1784,7 +1784,7 @@
                 <w:sz w:val="18"/>
                 <w:szCs w:val="18"/>
               </w:rPr>
-              <w:t xml:space="preserve">7</w:t>
+              <w:t xml:space="preserve">12</w:t>
             </w:r>
           </w:p>
         </w:tc>
@@ -1814,7 +1814,7 @@
                 <w:sz w:val="18"/>
                 <w:szCs w:val="18"/>
               </w:rPr>
-              <w:t xml:space="preserve">35 €</w:t>
+              <w:t xml:space="preserve">40 €</w:t>
             </w:r>
           </w:p>
         </w:tc>
@@ -1844,7 +1844,7 @@
                 <w:sz w:val="18"/>
                 <w:szCs w:val="18"/>
               </w:rPr>
-              <w:t xml:space="preserve">35 €</w:t>
+              <w:t xml:space="preserve">45 €</w:t>
             </w:r>
           </w:p>
         </w:tc>
@@ -1873,7 +1873,7 @@
                 <w:sz w:val="18"/>
                 <w:szCs w:val="18"/>
               </w:rPr>
-              <w:t xml:space="preserve">FR · Turc · EN</w:t>
+              <w:t xml:space="preserve">FR · EN</w:t>
             </w:r>
           </w:p>
         </w:tc>
@@ -1908,7 +1908,7 @@
                 <w:sz w:val="18"/>
                 <w:szCs w:val="18"/>
               </w:rPr>
-              <w:t xml:space="preserve">FERHAT Camelia</w:t>
+              <w:t xml:space="preserve">BEDORET Frédéric</w:t>
             </w:r>
           </w:p>
         </w:tc>
@@ -1937,7 +1937,7 @@
                 <w:sz w:val="18"/>
                 <w:szCs w:val="18"/>
               </w:rPr>
-              <w:t xml:space="preserve">0471 59 32 09</w:t>
+              <w:t xml:space="preserve">0478 93 62 09</w:t>
             </w:r>
           </w:p>
         </w:tc>
@@ -1996,7 +1996,7 @@
                 <w:sz w:val="18"/>
                 <w:szCs w:val="18"/>
               </w:rPr>
-              <w:t xml:space="preserve">22</w:t>
+              <w:t xml:space="preserve">47</w:t>
             </w:r>
           </w:p>
         </w:tc>
@@ -2026,7 +2026,7 @@
                 <w:sz w:val="18"/>
                 <w:szCs w:val="18"/>
               </w:rPr>
-              <w:t xml:space="preserve">3</w:t>
+              <w:t xml:space="preserve">1</w:t>
             </w:r>
           </w:p>
         </w:tc>
@@ -2056,7 +2056,7 @@
                 <w:sz w:val="18"/>
                 <w:szCs w:val="18"/>
               </w:rPr>
-              <w:t xml:space="preserve">30 €</w:t>
+              <w:t xml:space="preserve">35 €</w:t>
             </w:r>
           </w:p>
         </w:tc>
@@ -2115,7 +2115,7 @@
                 <w:sz w:val="18"/>
                 <w:szCs w:val="18"/>
               </w:rPr>
-              <w:t xml:space="preserve">FR · EN</w:t>
+              <w:t xml:space="preserve">FR · EN · NL</w:t>
             </w:r>
           </w:p>
         </w:tc>
@@ -2150,7 +2150,7 @@
                 <w:sz w:val="18"/>
                 <w:szCs w:val="18"/>
               </w:rPr>
-              <w:t xml:space="preserve">HOUMID BENNANI Mourad</w:t>
+              <w:t xml:space="preserve">CELIK Alpaslan</w:t>
             </w:r>
           </w:p>
         </w:tc>
@@ -2179,7 +2179,7 @@
                 <w:sz w:val="18"/>
                 <w:szCs w:val="18"/>
               </w:rPr>
-              <w:t xml:space="preserve">0489 23 33 19</w:t>
+              <w:t xml:space="preserve">0484 53 89 23</w:t>
             </w:r>
           </w:p>
         </w:tc>
@@ -2208,7 +2208,7 @@
                 <w:sz w:val="18"/>
                 <w:szCs w:val="18"/>
               </w:rPr>
-              <w:t xml:space="preserve">Initiateur (2e niveau)</w:t>
+              <w:t xml:space="preserve">Animateur (1er niveau)</w:t>
             </w:r>
           </w:p>
         </w:tc>
@@ -2238,7 +2238,7 @@
                 <w:sz w:val="18"/>
                 <w:szCs w:val="18"/>
               </w:rPr>
-              <w:t xml:space="preserve">50</w:t>
+              <w:t xml:space="preserve">43</w:t>
             </w:r>
           </w:p>
         </w:tc>
@@ -2268,7 +2268,7 @@
                 <w:sz w:val="18"/>
                 <w:szCs w:val="18"/>
               </w:rPr>
-              <w:t xml:space="preserve">23</w:t>
+              <w:t xml:space="preserve">18</w:t>
             </w:r>
           </w:p>
         </w:tc>
@@ -2298,42 +2298,42 @@
                 <w:sz w:val="18"/>
                 <w:szCs w:val="18"/>
               </w:rPr>
+              <w:t xml:space="preserve">40 €</w:t>
+            </w:r>
+          </w:p>
+        </w:tc>
+        <w:tc>
+          <w:tcPr>
+            <w:tcW w:type="dxa" w:w="1360"/>
+            <w:shd w:fill="FAFAF6" w:color="auto" w:val="clear"/>
+            <w:tcMar>
+              <w:top w:type="dxa" w:w="62"/>
+              <w:left w:type="dxa" w:w="113"/>
+              <w:bottom w:type="dxa" w:w="62"/>
+              <w:right w:type="dxa" w:w="113"/>
+            </w:tcMar>
+            <w:vAlign w:val="center"/>
+          </w:tcPr>
+          <w:p>
+            <w:pPr>
+              <w:spacing w:after="0" w:before="0" w:line="215"/>
+              <w:jc w:val="center"/>
+            </w:pPr>
+            <w:r>
+              <w:rPr>
+                <w:rFonts w:ascii="Calibri" w:cs="Calibri" w:eastAsia="Calibri" w:hAnsi="Calibri"/>
+                <w:b w:val="false"/>
+                <w:bCs w:val="false"/>
+                <w:color w:val="C0392B"/>
+                <w:sz w:val="18"/>
+                <w:szCs w:val="18"/>
+              </w:rPr>
               <w:t xml:space="preserve">50 €</w:t>
             </w:r>
           </w:p>
         </w:tc>
         <w:tc>
           <w:tcPr>
-            <w:tcW w:type="dxa" w:w="1360"/>
-            <w:shd w:fill="FAFAF6" w:color="auto" w:val="clear"/>
-            <w:tcMar>
-              <w:top w:type="dxa" w:w="62"/>
-              <w:left w:type="dxa" w:w="113"/>
-              <w:bottom w:type="dxa" w:w="62"/>
-              <w:right w:type="dxa" w:w="113"/>
-            </w:tcMar>
-            <w:vAlign w:val="center"/>
-          </w:tcPr>
-          <w:p>
-            <w:pPr>
-              <w:spacing w:after="0" w:before="0" w:line="215"/>
-              <w:jc w:val="center"/>
-            </w:pPr>
-            <w:r>
-              <w:rPr>
-                <w:rFonts w:ascii="Calibri" w:cs="Calibri" w:eastAsia="Calibri" w:hAnsi="Calibri"/>
-                <w:b w:val="false"/>
-                <w:bCs w:val="false"/>
-                <w:color w:val="C0392B"/>
-                <w:sz w:val="18"/>
-                <w:szCs w:val="18"/>
-              </w:rPr>
-              <w:t xml:space="preserve">50 €</w:t>
-            </w:r>
-          </w:p>
-        </w:tc>
-        <w:tc>
-          <w:tcPr>
             <w:tcW w:type="dxa" w:w="3514"/>
             <w:shd w:fill="FAFAF6" w:color="auto" w:val="clear"/>
             <w:tcMar>
@@ -2357,7 +2357,7 @@
                 <w:sz w:val="18"/>
                 <w:szCs w:val="18"/>
               </w:rPr>
-              <w:t xml:space="preserve">—</w:t>
+              <w:t xml:space="preserve">FR · NL · EN · Turc</w:t>
             </w:r>
           </w:p>
         </w:tc>
@@ -2392,7 +2392,7 @@
                 <w:sz w:val="18"/>
                 <w:szCs w:val="18"/>
               </w:rPr>
-              <w:t xml:space="preserve">LAMAIZI Jad</w:t>
+              <w:t xml:space="preserve">ERYILMAZ Zeliha</w:t>
             </w:r>
           </w:p>
         </w:tc>
@@ -2421,7 +2421,7 @@
                 <w:sz w:val="18"/>
                 <w:szCs w:val="18"/>
               </w:rPr>
-              <w:t xml:space="preserve">0492 65 01 89</w:t>
+              <w:t xml:space="preserve">0488 57 23 80</w:t>
             </w:r>
           </w:p>
         </w:tc>
@@ -2480,7 +2480,7 @@
                 <w:sz w:val="18"/>
                 <w:szCs w:val="18"/>
               </w:rPr>
-              <w:t xml:space="preserve">23</w:t>
+              <w:t xml:space="preserve">21</w:t>
             </w:r>
           </w:p>
         </w:tc>
@@ -2510,7 +2510,7 @@
                 <w:sz w:val="18"/>
                 <w:szCs w:val="18"/>
               </w:rPr>
-              <w:t xml:space="preserve">5</w:t>
+              <w:t xml:space="preserve">7</w:t>
             </w:r>
           </w:p>
         </w:tc>
@@ -2540,7 +2540,7 @@
                 <w:sz w:val="18"/>
                 <w:szCs w:val="18"/>
               </w:rPr>
-              <w:t xml:space="preserve">40 €</w:t>
+              <w:t xml:space="preserve">35 €</w:t>
             </w:r>
           </w:p>
         </w:tc>
@@ -2570,7 +2570,7 @@
                 <w:sz w:val="18"/>
                 <w:szCs w:val="18"/>
               </w:rPr>
-              <w:t xml:space="preserve">50 €</w:t>
+              <w:t xml:space="preserve">35 €</w:t>
             </w:r>
           </w:p>
         </w:tc>
@@ -2599,7 +2599,7 @@
                 <w:sz w:val="18"/>
                 <w:szCs w:val="18"/>
               </w:rPr>
-              <w:t xml:space="preserve">FR · ES · EN · NL</w:t>
+              <w:t xml:space="preserve">FR · Turc · EN</w:t>
             </w:r>
           </w:p>
         </w:tc>
@@ -2634,7 +2634,7 @@
                 <w:sz w:val="18"/>
                 <w:szCs w:val="18"/>
               </w:rPr>
-              <w:t xml:space="preserve">LOYO Mario</w:t>
+              <w:t xml:space="preserve">FERHAT Camelia</w:t>
             </w:r>
           </w:p>
         </w:tc>
@@ -2663,7 +2663,7 @@
                 <w:sz w:val="18"/>
                 <w:szCs w:val="18"/>
               </w:rPr>
-              <w:t xml:space="preserve">0474 40 68 70</w:t>
+              <w:t xml:space="preserve">0471 59 32 09</w:t>
             </w:r>
           </w:p>
         </w:tc>
@@ -2722,7 +2722,7 @@
                 <w:sz w:val="18"/>
                 <w:szCs w:val="18"/>
               </w:rPr>
-              <w:t xml:space="preserve">56</w:t>
+              <w:t xml:space="preserve">22</w:t>
             </w:r>
           </w:p>
         </w:tc>
@@ -2752,7 +2752,7 @@
                 <w:sz w:val="18"/>
                 <w:szCs w:val="18"/>
               </w:rPr>
-              <w:t xml:space="preserve">10</w:t>
+              <w:t xml:space="preserve">3</w:t>
             </w:r>
           </w:p>
         </w:tc>
@@ -2782,42 +2782,42 @@
                 <w:sz w:val="18"/>
                 <w:szCs w:val="18"/>
               </w:rPr>
+              <w:t xml:space="preserve">30 €</w:t>
+            </w:r>
+          </w:p>
+        </w:tc>
+        <w:tc>
+          <w:tcPr>
+            <w:tcW w:type="dxa" w:w="1360"/>
+            <w:shd w:fill="FAFAF6" w:color="auto" w:val="clear"/>
+            <w:tcMar>
+              <w:top w:type="dxa" w:w="62"/>
+              <w:left w:type="dxa" w:w="113"/>
+              <w:bottom w:type="dxa" w:w="62"/>
+              <w:right w:type="dxa" w:w="113"/>
+            </w:tcMar>
+            <w:vAlign w:val="center"/>
+          </w:tcPr>
+          <w:p>
+            <w:pPr>
+              <w:spacing w:after="0" w:before="0" w:line="215"/>
+              <w:jc w:val="center"/>
+            </w:pPr>
+            <w:r>
+              <w:rPr>
+                <w:rFonts w:ascii="Calibri" w:cs="Calibri" w:eastAsia="Calibri" w:hAnsi="Calibri"/>
+                <w:b w:val="false"/>
+                <w:bCs w:val="false"/>
+                <w:color w:val="C0392B"/>
+                <w:sz w:val="18"/>
+                <w:szCs w:val="18"/>
+              </w:rPr>
               <w:t xml:space="preserve">35 €</w:t>
             </w:r>
           </w:p>
         </w:tc>
         <w:tc>
           <w:tcPr>
-            <w:tcW w:type="dxa" w:w="1360"/>
-            <w:shd w:fill="FAFAF6" w:color="auto" w:val="clear"/>
-            <w:tcMar>
-              <w:top w:type="dxa" w:w="62"/>
-              <w:left w:type="dxa" w:w="113"/>
-              <w:bottom w:type="dxa" w:w="62"/>
-              <w:right w:type="dxa" w:w="113"/>
-            </w:tcMar>
-            <w:vAlign w:val="center"/>
-          </w:tcPr>
-          <w:p>
-            <w:pPr>
-              <w:spacing w:after="0" w:before="0" w:line="215"/>
-              <w:jc w:val="center"/>
-            </w:pPr>
-            <w:r>
-              <w:rPr>
-                <w:rFonts w:ascii="Calibri" w:cs="Calibri" w:eastAsia="Calibri" w:hAnsi="Calibri"/>
-                <w:b w:val="false"/>
-                <w:bCs w:val="false"/>
-                <w:color w:val="C0392B"/>
-                <w:sz w:val="18"/>
-                <w:szCs w:val="18"/>
-              </w:rPr>
-              <w:t xml:space="preserve">40 €</w:t>
-            </w:r>
-          </w:p>
-        </w:tc>
-        <w:tc>
-          <w:tcPr>
             <w:tcW w:type="dxa" w:w="3514"/>
             <w:shd w:fill="FAFAF6" w:color="auto" w:val="clear"/>
             <w:tcMar>
@@ -2841,7 +2841,7 @@
                 <w:sz w:val="18"/>
                 <w:szCs w:val="18"/>
               </w:rPr>
-              <w:t xml:space="preserve">FR · ES</w:t>
+              <w:t xml:space="preserve">FR · EN</w:t>
             </w:r>
           </w:p>
         </w:tc>
@@ -2876,7 +2876,7 @@
                 <w:sz w:val="18"/>
                 <w:szCs w:val="18"/>
               </w:rPr>
-              <w:t xml:space="preserve">SAOUL Jérémie</w:t>
+              <w:t xml:space="preserve">LAMAIZI Jad</w:t>
             </w:r>
           </w:p>
         </w:tc>
@@ -2905,7 +2905,7 @@
                 <w:sz w:val="18"/>
                 <w:szCs w:val="18"/>
               </w:rPr>
-              <w:t xml:space="preserve">0474 64 40 04</w:t>
+              <w:t xml:space="preserve">0492 65 01 89</w:t>
             </w:r>
           </w:p>
         </w:tc>
@@ -2934,7 +2934,7 @@
                 <w:sz w:val="18"/>
                 <w:szCs w:val="18"/>
               </w:rPr>
-              <w:t xml:space="preserve">Initiateur (2e niveau)</w:t>
+              <w:t xml:space="preserve">Animateur (1er niveau)</w:t>
             </w:r>
           </w:p>
         </w:tc>
@@ -2994,7 +2994,7 @@
                 <w:sz w:val="18"/>
                 <w:szCs w:val="18"/>
               </w:rPr>
-              <w:t xml:space="preserve">2</w:t>
+              <w:t xml:space="preserve">5</w:t>
             </w:r>
           </w:p>
         </w:tc>
@@ -3054,7 +3054,7 @@
                 <w:sz w:val="18"/>
                 <w:szCs w:val="18"/>
               </w:rPr>
-              <w:t xml:space="preserve">40 €</w:t>
+              <w:t xml:space="preserve">50 €</w:t>
             </w:r>
           </w:p>
         </w:tc>
@@ -3083,7 +3083,7 @@
                 <w:sz w:val="18"/>
                 <w:szCs w:val="18"/>
               </w:rPr>
-              <w:t xml:space="preserve">FR · NL · EN</w:t>
+              <w:t xml:space="preserve">FR · ES · EN · NL</w:t>
             </w:r>
           </w:p>
         </w:tc>
@@ -3118,7 +3118,7 @@
                 <w:sz w:val="18"/>
                 <w:szCs w:val="18"/>
               </w:rPr>
-              <w:t xml:space="preserve">TAIEB Adel</w:t>
+              <w:t xml:space="preserve">LOYO Mario</w:t>
             </w:r>
           </w:p>
         </w:tc>
@@ -3147,7 +3147,7 @@
                 <w:sz w:val="18"/>
                 <w:szCs w:val="18"/>
               </w:rPr>
-              <w:t xml:space="preserve">0479 65 01 99</w:t>
+              <w:t xml:space="preserve">0474 40 68 70</w:t>
             </w:r>
           </w:p>
         </w:tc>
@@ -3236,7 +3236,7 @@
                 <w:sz w:val="18"/>
                 <w:szCs w:val="18"/>
               </w:rPr>
-              <w:t xml:space="preserve">11</w:t>
+              <w:t xml:space="preserve">10</w:t>
             </w:r>
           </w:p>
         </w:tc>
@@ -3266,42 +3266,42 @@
                 <w:sz w:val="18"/>
                 <w:szCs w:val="18"/>
               </w:rPr>
+              <w:t xml:space="preserve">35 €</w:t>
+            </w:r>
+          </w:p>
+        </w:tc>
+        <w:tc>
+          <w:tcPr>
+            <w:tcW w:type="dxa" w:w="1360"/>
+            <w:shd w:fill="FAFAF6" w:color="auto" w:val="clear"/>
+            <w:tcMar>
+              <w:top w:type="dxa" w:w="62"/>
+              <w:left w:type="dxa" w:w="113"/>
+              <w:bottom w:type="dxa" w:w="62"/>
+              <w:right w:type="dxa" w:w="113"/>
+            </w:tcMar>
+            <w:vAlign w:val="center"/>
+          </w:tcPr>
+          <w:p>
+            <w:pPr>
+              <w:spacing w:after="0" w:before="0" w:line="215"/>
+              <w:jc w:val="center"/>
+            </w:pPr>
+            <w:r>
+              <w:rPr>
+                <w:rFonts w:ascii="Calibri" w:cs="Calibri" w:eastAsia="Calibri" w:hAnsi="Calibri"/>
+                <w:b w:val="false"/>
+                <w:bCs w:val="false"/>
+                <w:color w:val="C0392B"/>
+                <w:sz w:val="18"/>
+                <w:szCs w:val="18"/>
+              </w:rPr>
               <w:t xml:space="preserve">40 €</w:t>
             </w:r>
           </w:p>
         </w:tc>
         <w:tc>
           <w:tcPr>
-            <w:tcW w:type="dxa" w:w="1360"/>
-            <w:shd w:fill="FAFAF6" w:color="auto" w:val="clear"/>
-            <w:tcMar>
-              <w:top w:type="dxa" w:w="62"/>
-              <w:left w:type="dxa" w:w="113"/>
-              <w:bottom w:type="dxa" w:w="62"/>
-              <w:right w:type="dxa" w:w="113"/>
-            </w:tcMar>
-            <w:vAlign w:val="center"/>
-          </w:tcPr>
-          <w:p>
-            <w:pPr>
-              <w:spacing w:after="0" w:before="0" w:line="215"/>
-              <w:jc w:val="center"/>
-            </w:pPr>
-            <w:r>
-              <w:rPr>
-                <w:rFonts w:ascii="Calibri" w:cs="Calibri" w:eastAsia="Calibri" w:hAnsi="Calibri"/>
-                <w:b w:val="false"/>
-                <w:bCs w:val="false"/>
-                <w:color w:val="C0392B"/>
-                <w:sz w:val="18"/>
-                <w:szCs w:val="18"/>
-              </w:rPr>
-              <w:t xml:space="preserve">40 €</w:t>
-            </w:r>
-          </w:p>
-        </w:tc>
-        <w:tc>
-          <w:tcPr>
             <w:tcW w:type="dxa" w:w="3514"/>
             <w:shd w:fill="FAFAF6" w:color="auto" w:val="clear"/>
             <w:tcMar>
@@ -3325,7 +3325,7 @@
                 <w:sz w:val="18"/>
                 <w:szCs w:val="18"/>
               </w:rPr>
-              <w:t xml:space="preserve">FR · NL · EN · Arabe · ES</w:t>
+              <w:t xml:space="preserve">FR · ES</w:t>
             </w:r>
           </w:p>
         </w:tc>
@@ -3360,7 +3360,7 @@
                 <w:sz w:val="18"/>
                 <w:szCs w:val="18"/>
               </w:rPr>
-              <w:t xml:space="preserve">TAIEB Elias</w:t>
+              <w:t xml:space="preserve">TAIEB Adel</w:t>
             </w:r>
           </w:p>
         </w:tc>
@@ -3389,7 +3389,7 @@
                 <w:sz w:val="18"/>
                 <w:szCs w:val="18"/>
               </w:rPr>
-              <w:t xml:space="preserve">0493 21 94 47</w:t>
+              <w:t xml:space="preserve">0479 65 01 99</w:t>
             </w:r>
           </w:p>
         </w:tc>
@@ -3418,7 +3418,7 @@
                 <w:sz w:val="18"/>
                 <w:szCs w:val="18"/>
               </w:rPr>
-              <w:t xml:space="preserve">Initiateur (2e niveau)</w:t>
+              <w:t xml:space="preserve">Animateur (1er niveau)</w:t>
             </w:r>
           </w:p>
         </w:tc>
@@ -3448,7 +3448,7 @@
                 <w:sz w:val="18"/>
                 <w:szCs w:val="18"/>
               </w:rPr>
-              <w:t xml:space="preserve">27</w:t>
+              <w:t xml:space="preserve">56</w:t>
             </w:r>
           </w:p>
         </w:tc>
@@ -3478,7 +3478,7 @@
                 <w:sz w:val="18"/>
                 <w:szCs w:val="18"/>
               </w:rPr>
-              <w:t xml:space="preserve">12</w:t>
+              <w:t xml:space="preserve">11</w:t>
             </w:r>
           </w:p>
         </w:tc>
@@ -3538,7 +3538,7 @@
                 <w:sz w:val="18"/>
                 <w:szCs w:val="18"/>
               </w:rPr>
-              <w:t xml:space="preserve">45 €</w:t>
+              <w:t xml:space="preserve">40 €</w:t>
             </w:r>
           </w:p>
         </w:tc>
@@ -3567,7 +3567,7 @@
                 <w:sz w:val="18"/>
                 <w:szCs w:val="18"/>
               </w:rPr>
-              <w:t xml:space="preserve">FR · EN</w:t>
+              <w:t xml:space="preserve">FR · NL · EN · Arabe · ES</w:t>
             </w:r>
           </w:p>
         </w:tc>

</xml_diff>